<commit_message>
update thong tin nhom bao cao
</commit_message>
<xml_diff>
--- a/DOCX/BAO_CAO_GROUP10.docx
+++ b/DOCX/BAO_CAO_GROUP10.docx
@@ -340,15 +340,10 @@
           <w:rFonts w:hint="default" w:ascii="Times New Roman" w:hAnsi="Times New Roman" w:cs="Times New Roman"/>
           <w:b/>
           <w:bCs/>
-          <w:color w:val="000000" w:themeColor="text1"/>
+          <w:color w:val="FF0000"/>
           <w:sz w:val="28"/>
           <w:szCs w:val="26"/>
           <w:lang w:val="vi-VN"/>
-          <w14:textFill>
-            <w14:solidFill>
-              <w14:schemeClr w14:val="tx1"/>
-            </w14:solidFill>
-          </w14:textFill>
         </w:rPr>
       </w:pPr>
       <w:r>
@@ -356,15 +351,10 @@
           <w:rFonts w:hint="default" w:ascii="Times New Roman" w:hAnsi="Times New Roman" w:cs="Times New Roman"/>
           <w:b/>
           <w:bCs/>
-          <w:color w:val="000000" w:themeColor="text1"/>
+          <w:color w:val="FF0000"/>
           <w:sz w:val="28"/>
           <w:szCs w:val="26"/>
           <w:lang w:val="vi-VN"/>
-          <w14:textFill>
-            <w14:solidFill>
-              <w14:schemeClr w14:val="tx1"/>
-            </w14:solidFill>
-          </w14:textFill>
         </w:rPr>
         <w:t>TÊN ĐỀ TÀI</w:t>
       </w:r>
@@ -373,14 +363,9 @@
           <w:rFonts w:ascii="Times New Roman" w:hAnsi="Times New Roman" w:cs="Times New Roman"/>
           <w:b/>
           <w:bCs/>
-          <w:color w:val="000000" w:themeColor="text1"/>
+          <w:color w:val="FF0000"/>
           <w:sz w:val="28"/>
           <w:szCs w:val="26"/>
-          <w14:textFill>
-            <w14:solidFill>
-              <w14:schemeClr w14:val="tx1"/>
-            </w14:solidFill>
-          </w14:textFill>
         </w:rPr>
         <w:t xml:space="preserve">: </w:t>
       </w:r>
@@ -389,15 +374,10 @@
           <w:rFonts w:hint="default" w:ascii="Times New Roman" w:hAnsi="Times New Roman" w:cs="Times New Roman"/>
           <w:b/>
           <w:bCs/>
-          <w:color w:val="000000" w:themeColor="text1"/>
+          <w:color w:val="FF0000"/>
           <w:sz w:val="28"/>
           <w:szCs w:val="26"/>
           <w:lang w:val="vi-VN" w:eastAsia="zh-CN"/>
-          <w14:textFill>
-            <w14:solidFill>
-              <w14:schemeClr w14:val="tx1"/>
-            </w14:solidFill>
-          </w14:textFill>
         </w:rPr>
         <w:t>B</w:t>
       </w:r>
@@ -406,15 +386,10 @@
           <w:rFonts w:hint="default" w:cs="Times New Roman"/>
           <w:b/>
           <w:bCs/>
-          <w:color w:val="000000" w:themeColor="text1"/>
+          <w:color w:val="FF0000"/>
           <w:sz w:val="28"/>
           <w:szCs w:val="26"/>
           <w:lang w:val="vi-VN" w:eastAsia="zh-CN"/>
-          <w14:textFill>
-            <w14:solidFill>
-              <w14:schemeClr w14:val="tx1"/>
-            </w14:solidFill>
-          </w14:textFill>
         </w:rPr>
         <w:t>UILD</w:t>
       </w:r>
@@ -423,15 +398,10 @@
           <w:rFonts w:hint="default" w:ascii="Times New Roman" w:hAnsi="Times New Roman" w:cs="Times New Roman"/>
           <w:b/>
           <w:bCs/>
-          <w:color w:val="000000" w:themeColor="text1"/>
+          <w:color w:val="FF0000"/>
           <w:sz w:val="28"/>
           <w:szCs w:val="26"/>
           <w:lang w:val="vi-VN" w:eastAsia="zh-CN"/>
-          <w14:textFill>
-            <w14:solidFill>
-              <w14:schemeClr w14:val="tx1"/>
-            </w14:solidFill>
-          </w14:textFill>
         </w:rPr>
         <w:t xml:space="preserve"> </w:t>
       </w:r>
@@ -440,15 +410,10 @@
           <w:rFonts w:hint="default" w:cs="Times New Roman"/>
           <w:b/>
           <w:bCs/>
-          <w:color w:val="000000" w:themeColor="text1"/>
+          <w:color w:val="FF0000"/>
           <w:sz w:val="28"/>
           <w:szCs w:val="26"/>
           <w:lang w:val="vi-VN" w:eastAsia="zh-CN"/>
-          <w14:textFill>
-            <w14:solidFill>
-              <w14:schemeClr w14:val="tx1"/>
-            </w14:solidFill>
-          </w14:textFill>
         </w:rPr>
         <w:t>AN</w:t>
       </w:r>
@@ -457,15 +422,10 @@
           <w:rFonts w:hint="default" w:ascii="Times New Roman" w:hAnsi="Times New Roman" w:cs="Times New Roman"/>
           <w:b/>
           <w:bCs/>
-          <w:color w:val="000000" w:themeColor="text1"/>
+          <w:color w:val="FF0000"/>
           <w:sz w:val="28"/>
           <w:szCs w:val="26"/>
           <w:lang w:val="vi-VN" w:eastAsia="zh-CN"/>
-          <w14:textFill>
-            <w14:solidFill>
-              <w14:schemeClr w14:val="tx1"/>
-            </w14:solidFill>
-          </w14:textFill>
         </w:rPr>
         <w:t xml:space="preserve"> APP </w:t>
       </w:r>
@@ -474,15 +434,10 @@
           <w:rFonts w:hint="default" w:cs="Times New Roman"/>
           <w:b/>
           <w:bCs/>
-          <w:color w:val="000000" w:themeColor="text1"/>
+          <w:color w:val="FF0000"/>
           <w:sz w:val="28"/>
           <w:szCs w:val="26"/>
           <w:lang w:val="vi-VN" w:eastAsia="zh-CN"/>
-          <w14:textFill>
-            <w14:solidFill>
-              <w14:schemeClr w14:val="tx1"/>
-            </w14:solidFill>
-          </w14:textFill>
         </w:rPr>
         <w:t>FOR</w:t>
       </w:r>
@@ -491,15 +446,10 @@
           <w:rFonts w:hint="default" w:ascii="Times New Roman" w:hAnsi="Times New Roman" w:cs="Times New Roman"/>
           <w:b/>
           <w:bCs/>
-          <w:color w:val="000000" w:themeColor="text1"/>
+          <w:color w:val="FF0000"/>
           <w:sz w:val="28"/>
           <w:szCs w:val="26"/>
           <w:lang w:val="vi-VN" w:eastAsia="zh-CN"/>
-          <w14:textFill>
-            <w14:solidFill>
-              <w14:schemeClr w14:val="tx1"/>
-            </w14:solidFill>
-          </w14:textFill>
         </w:rPr>
         <w:t xml:space="preserve"> </w:t>
       </w:r>
@@ -508,15 +458,10 @@
           <w:rFonts w:hint="default" w:cs="Times New Roman"/>
           <w:b/>
           <w:bCs/>
-          <w:color w:val="000000" w:themeColor="text1"/>
+          <w:color w:val="FF0000"/>
           <w:sz w:val="28"/>
           <w:szCs w:val="26"/>
           <w:lang w:val="vi-VN" w:eastAsia="zh-CN"/>
-          <w14:textFill>
-            <w14:solidFill>
-              <w14:schemeClr w14:val="tx1"/>
-            </w14:solidFill>
-          </w14:textFill>
         </w:rPr>
         <w:t>DEMONSTRATION</w:t>
       </w:r>
@@ -525,15 +470,10 @@
           <w:rFonts w:hint="default" w:ascii="Times New Roman" w:hAnsi="Times New Roman" w:cs="Times New Roman"/>
           <w:b/>
           <w:bCs/>
-          <w:color w:val="000000" w:themeColor="text1"/>
+          <w:color w:val="FF0000"/>
           <w:sz w:val="28"/>
           <w:szCs w:val="26"/>
           <w:lang w:val="vi-VN" w:eastAsia="zh-CN"/>
-          <w14:textFill>
-            <w14:solidFill>
-              <w14:schemeClr w14:val="tx1"/>
-            </w14:solidFill>
-          </w14:textFill>
         </w:rPr>
         <w:t xml:space="preserve"> V</w:t>
       </w:r>
@@ -542,15 +482,10 @@
           <w:rFonts w:hint="default" w:cs="Times New Roman"/>
           <w:b/>
           <w:bCs/>
-          <w:color w:val="000000" w:themeColor="text1"/>
+          <w:color w:val="FF0000"/>
           <w:sz w:val="28"/>
           <w:szCs w:val="26"/>
           <w:lang w:val="en-US" w:eastAsia="zh-CN"/>
-          <w14:textFill>
-            <w14:solidFill>
-              <w14:schemeClr w14:val="tx1"/>
-            </w14:solidFill>
-          </w14:textFill>
         </w:rPr>
         <w:t>IRTUAL</w:t>
       </w:r>
@@ -559,15 +494,10 @@
           <w:rFonts w:hint="default" w:ascii="Times New Roman" w:hAnsi="Times New Roman" w:cs="Times New Roman"/>
           <w:b/>
           <w:bCs/>
-          <w:color w:val="000000" w:themeColor="text1"/>
+          <w:color w:val="FF0000"/>
           <w:sz w:val="28"/>
           <w:szCs w:val="26"/>
           <w:lang w:val="vi-VN" w:eastAsia="zh-CN"/>
-          <w14:textFill>
-            <w14:solidFill>
-              <w14:schemeClr w14:val="tx1"/>
-            </w14:solidFill>
-          </w14:textFill>
         </w:rPr>
         <w:t xml:space="preserve"> M</w:t>
       </w:r>
@@ -576,15 +506,10 @@
           <w:rFonts w:hint="default" w:cs="Times New Roman"/>
           <w:b/>
           <w:bCs/>
-          <w:color w:val="000000" w:themeColor="text1"/>
+          <w:color w:val="FF0000"/>
           <w:sz w:val="28"/>
           <w:szCs w:val="26"/>
           <w:lang w:val="en-US" w:eastAsia="zh-CN"/>
-          <w14:textFill>
-            <w14:solidFill>
-              <w14:schemeClr w14:val="tx1"/>
-            </w14:solidFill>
-          </w14:textFill>
         </w:rPr>
         <w:t>EMORY</w:t>
       </w:r>
@@ -593,15 +518,10 @@
           <w:rFonts w:hint="default" w:ascii="Times New Roman" w:hAnsi="Times New Roman" w:cs="Times New Roman"/>
           <w:b/>
           <w:bCs/>
-          <w:color w:val="000000" w:themeColor="text1"/>
+          <w:color w:val="FF0000"/>
           <w:sz w:val="28"/>
           <w:szCs w:val="26"/>
           <w:lang w:val="vi-VN" w:eastAsia="zh-CN"/>
-          <w14:textFill>
-            <w14:solidFill>
-              <w14:schemeClr w14:val="tx1"/>
-            </w14:solidFill>
-          </w14:textFill>
         </w:rPr>
         <w:t xml:space="preserve"> </w:t>
       </w:r>
@@ -610,15 +530,10 @@
           <w:rFonts w:hint="default" w:cs="Times New Roman"/>
           <w:b/>
           <w:bCs/>
-          <w:color w:val="000000" w:themeColor="text1"/>
+          <w:color w:val="FF0000"/>
           <w:sz w:val="28"/>
           <w:szCs w:val="26"/>
           <w:lang w:val="en-US" w:eastAsia="zh-CN"/>
-          <w14:textFill>
-            <w14:solidFill>
-              <w14:schemeClr w14:val="tx1"/>
-            </w14:solidFill>
-          </w14:textFill>
         </w:rPr>
         <w:t>MANAGEMENT</w:t>
       </w:r>
@@ -627,15 +542,10 @@
           <w:rFonts w:hint="default" w:ascii="Times New Roman" w:hAnsi="Times New Roman" w:cs="Times New Roman"/>
           <w:b/>
           <w:bCs/>
-          <w:color w:val="000000" w:themeColor="text1"/>
+          <w:color w:val="FF0000"/>
           <w:sz w:val="28"/>
           <w:szCs w:val="26"/>
           <w:lang w:val="vi-VN" w:eastAsia="zh-CN"/>
-          <w14:textFill>
-            <w14:solidFill>
-              <w14:schemeClr w14:val="tx1"/>
-            </w14:solidFill>
-          </w14:textFill>
         </w:rPr>
         <w:t xml:space="preserve"> </w:t>
       </w:r>
@@ -644,15 +554,10 @@
           <w:rFonts w:hint="default" w:cs="Times New Roman"/>
           <w:b/>
           <w:bCs/>
-          <w:color w:val="000000" w:themeColor="text1"/>
+          <w:color w:val="FF0000"/>
           <w:sz w:val="28"/>
           <w:szCs w:val="26"/>
           <w:lang w:val="en-US" w:eastAsia="zh-CN"/>
-          <w14:textFill>
-            <w14:solidFill>
-              <w14:schemeClr w14:val="tx1"/>
-            </w14:solidFill>
-          </w14:textFill>
         </w:rPr>
         <w:t>ALGORITHM</w:t>
       </w:r>
@@ -661,15 +566,10 @@
           <w:rFonts w:hint="default" w:ascii="Times New Roman" w:hAnsi="Times New Roman" w:cs="Times New Roman"/>
           <w:b/>
           <w:bCs/>
-          <w:color w:val="000000" w:themeColor="text1"/>
+          <w:color w:val="FF0000"/>
           <w:sz w:val="28"/>
           <w:szCs w:val="26"/>
           <w:lang w:val="vi-VN" w:eastAsia="zh-CN"/>
-          <w14:textFill>
-            <w14:solidFill>
-              <w14:schemeClr w14:val="tx1"/>
-            </w14:solidFill>
-          </w14:textFill>
         </w:rPr>
         <w:t xml:space="preserve">: LRU, FIFO </w:t>
       </w:r>
@@ -678,15 +578,10 @@
           <w:rFonts w:hint="default" w:cs="Times New Roman"/>
           <w:b/>
           <w:bCs/>
-          <w:color w:val="000000" w:themeColor="text1"/>
+          <w:color w:val="FF0000"/>
           <w:sz w:val="28"/>
           <w:szCs w:val="26"/>
           <w:lang w:val="en-US" w:eastAsia="zh-CN"/>
-          <w14:textFill>
-            <w14:solidFill>
-              <w14:schemeClr w14:val="tx1"/>
-            </w14:solidFill>
-          </w14:textFill>
         </w:rPr>
         <w:t>AND</w:t>
       </w:r>
@@ -695,56 +590,17 @@
           <w:rFonts w:hint="default" w:ascii="Times New Roman" w:hAnsi="Times New Roman" w:cs="Times New Roman"/>
           <w:b/>
           <w:bCs/>
-          <w:color w:val="000000" w:themeColor="text1"/>
+          <w:color w:val="FF0000"/>
           <w:sz w:val="28"/>
           <w:szCs w:val="26"/>
           <w:lang w:val="vi-VN" w:eastAsia="zh-CN"/>
-          <w14:textFill>
-            <w14:solidFill>
-              <w14:schemeClr w14:val="tx1"/>
-            </w14:solidFill>
-          </w14:textFill>
         </w:rPr>
         <w:t xml:space="preserve"> OPT</w:t>
       </w:r>
     </w:p>
     <w:p>
       <w:pPr>
-        <w:spacing w:line="360" w:lineRule="auto"/>
-        <w:jc w:val="center"/>
-        <w:rPr>
-          <w:rFonts w:hint="default" w:ascii="Times New Roman" w:hAnsi="Times New Roman" w:cs="Times New Roman"/>
-          <w:b/>
-          <w:bCs/>
-          <w:color w:val="000000" w:themeColor="text1"/>
-          <w:sz w:val="28"/>
-          <w:szCs w:val="26"/>
-          <w:lang w:val="vi-VN"/>
-          <w14:textFill>
-            <w14:solidFill>
-              <w14:schemeClr w14:val="tx1"/>
-            </w14:solidFill>
-          </w14:textFill>
-        </w:rPr>
-      </w:pPr>
-    </w:p>
-    <w:p>
-      <w:pPr>
-        <w:spacing w:line="360" w:lineRule="auto"/>
-        <w:jc w:val="both"/>
-        <w:rPr>
-          <w:rFonts w:ascii="Times New Roman" w:hAnsi="Times New Roman" w:cs="Times New Roman"/>
-          <w:b/>
-          <w:bCs/>
-          <w:color w:val="000000" w:themeColor="text1"/>
-          <w:sz w:val="26"/>
-          <w:szCs w:val="26"/>
-          <w14:textFill>
-            <w14:solidFill>
-              <w14:schemeClr w14:val="tx1"/>
-            </w14:solidFill>
-          </w14:textFill>
-        </w:rPr>
+        <w:bidi w:val="0"/>
       </w:pPr>
     </w:p>
     <w:p>
@@ -784,112 +640,251 @@
     <w:p>
       <w:pPr>
         <w:bidi w:val="0"/>
-      </w:pPr>
+        <w:ind w:left="0" w:leftChars="0" w:firstLine="520" w:firstLineChars="0"/>
+      </w:pPr>
+      <w:r>
+        <w:rPr>
+          <w:rFonts w:hint="default"/>
+          <w:lang w:val="vi-VN"/>
+        </w:rPr>
+        <w:t>Nguyễn Hoàng Duy</w:t>
+      </w:r>
+      <w:r>
+        <w:tab/>
+      </w:r>
+      <w:r>
+        <w:tab/>
+      </w:r>
+      <w:r>
+        <w:tab/>
+      </w:r>
+      <w:r>
+        <w:tab/>
+      </w:r>
       <w:r>
         <w:rPr>
           <w:rFonts w:hint="default"/>
           <w:lang w:val="en-US"/>
         </w:rPr>
+        <w:t xml:space="preserve">   </w:t>
+      </w:r>
+      <w:r>
+        <w:rPr>
+          <w:rFonts w:hint="default"/>
+          <w:lang w:val="vi-VN"/>
+        </w:rPr>
+        <w:tab/>
+      </w:r>
+      <w:r>
+        <w:t>MSSV:</w:t>
+      </w:r>
+      <w:r>
+        <w:rPr>
+          <w:rFonts w:hint="default"/>
+          <w:lang w:val="vi-VN"/>
+        </w:rPr>
+        <w:t xml:space="preserve"> 080206011748</w:t>
+      </w:r>
+      <w:r>
         <w:t xml:space="preserve"> </w:t>
       </w:r>
-      <w:r>
-        <w:tab/>
-      </w:r>
-      <w:r>
-        <w:tab/>
-      </w:r>
-      <w:r>
-        <w:tab/>
-      </w:r>
-      <w:r>
-        <w:tab/>
+    </w:p>
+    <w:p>
+      <w:pPr>
+        <w:bidi w:val="0"/>
+        <w:ind w:left="0" w:leftChars="0" w:firstLine="520" w:firstLineChars="0"/>
+        <w:rPr>
+          <w:rFonts w:hint="default"/>
+          <w:lang w:val="vi-VN"/>
+        </w:rPr>
+      </w:pPr>
+      <w:r>
+        <w:rPr>
+          <w:rFonts w:hint="default"/>
+          <w:lang w:val="vi-VN"/>
+        </w:rPr>
+        <w:t>Nguyễn Gia Huy</w:t>
       </w:r>
       <w:r>
         <w:rPr>
           <w:rFonts w:hint="default"/>
           <w:lang w:val="en-US"/>
         </w:rPr>
-        <w:t xml:space="preserve">           </w:t>
-      </w:r>
-      <w:r>
-        <w:t xml:space="preserve">MSSV: </w:t>
-      </w:r>
-      <w:bookmarkStart w:id="6" w:name="_GoBack"/>
-      <w:bookmarkEnd w:id="6"/>
-    </w:p>
-    <w:p>
-      <w:pPr>
-        <w:bidi w:val="0"/>
-        <w:rPr>
-          <w:rFonts w:hint="default"/>
-          <w:lang w:val="vi-VN"/>
-        </w:rPr>
-      </w:pPr>
+        <w:t xml:space="preserve">  </w:t>
+      </w:r>
+      <w:r>
+        <w:tab/>
+      </w:r>
+      <w:r>
+        <w:tab/>
+      </w:r>
+      <w:r>
+        <w:tab/>
+      </w:r>
       <w:r>
         <w:rPr>
           <w:rFonts w:hint="default"/>
           <w:lang w:val="en-US"/>
         </w:rPr>
-        <w:t xml:space="preserve">  </w:t>
-      </w:r>
-      <w:r>
+        <w:t xml:space="preserve">         </w:t>
+      </w:r>
+      <w:r>
+        <w:rPr>
+          <w:rFonts w:hint="default"/>
+          <w:lang w:val="vi-VN"/>
+        </w:rPr>
         <w:tab/>
       </w:r>
       <w:r>
-        <w:tab/>
-      </w:r>
-      <w:r>
-        <w:tab/>
+        <w:t xml:space="preserve">MSSV: </w:t>
+      </w:r>
+    </w:p>
+    <w:p>
+      <w:pPr>
+        <w:bidi w:val="0"/>
+        <w:ind w:left="0" w:leftChars="0" w:firstLine="520" w:firstLineChars="0"/>
+        <w:rPr>
+          <w:rFonts w:hint="default"/>
+          <w:lang w:val="vi-VN"/>
+        </w:rPr>
+      </w:pPr>
+      <w:r>
+        <w:rPr>
+          <w:rFonts w:hint="default"/>
+          <w:lang w:val="vi-VN"/>
+        </w:rPr>
+        <w:t xml:space="preserve">Lê Minh Khang </w:t>
       </w:r>
       <w:r>
         <w:rPr>
           <w:rFonts w:hint="default"/>
           <w:lang w:val="en-US"/>
         </w:rPr>
-        <w:t xml:space="preserve">                 </w:t>
-      </w:r>
-      <w:r>
-        <w:t xml:space="preserve">MSSV: </w:t>
-      </w:r>
-    </w:p>
-    <w:p>
-      <w:pPr>
-        <w:bidi w:val="0"/>
-        <w:rPr>
-          <w:rFonts w:hint="default"/>
-          <w:lang w:val="vi-VN"/>
-        </w:rPr>
-      </w:pPr>
+        <w:t xml:space="preserve"> </w:t>
+      </w:r>
+      <w:r>
+        <w:tab/>
+      </w:r>
+      <w:r>
+        <w:tab/>
+      </w:r>
+      <w:r>
+        <w:tab/>
+      </w:r>
       <w:r>
         <w:rPr>
           <w:rFonts w:hint="default"/>
           <w:lang w:val="en-US"/>
         </w:rPr>
-        <w:t xml:space="preserve"> </w:t>
-      </w:r>
-      <w:r>
+        <w:t xml:space="preserve">         </w:t>
+      </w:r>
+      <w:r>
+        <w:rPr>
+          <w:rFonts w:hint="default"/>
+          <w:lang w:val="vi-VN"/>
+        </w:rPr>
         <w:tab/>
       </w:r>
       <w:r>
+        <w:t>MSSV:</w:t>
+      </w:r>
+    </w:p>
+    <w:p>
+      <w:pPr>
+        <w:bidi w:val="0"/>
+        <w:ind w:left="0" w:leftChars="0" w:firstLine="520" w:firstLineChars="0"/>
+        <w:rPr>
+          <w:rFonts w:hint="default"/>
+          <w:lang w:val="vi-VN"/>
+        </w:rPr>
+      </w:pPr>
+      <w:r>
+        <w:rPr>
+          <w:rFonts w:hint="default"/>
+          <w:lang w:val="vi-VN"/>
+        </w:rPr>
+        <w:t xml:space="preserve">Trương Văn Hào                         </w:t>
+      </w:r>
+      <w:r>
+        <w:rPr>
+          <w:rFonts w:hint="default"/>
+          <w:lang w:val="vi-VN"/>
+        </w:rPr>
         <w:tab/>
-      </w:r>
-      <w:r>
+        <w:t>MSSV:</w:t>
+      </w:r>
+    </w:p>
+    <w:p>
+      <w:pPr>
+        <w:bidi w:val="0"/>
+        <w:ind w:left="0" w:leftChars="0" w:firstLine="520" w:firstLineChars="0"/>
+        <w:rPr>
+          <w:rFonts w:hint="default"/>
+          <w:lang w:val="vi-VN"/>
+        </w:rPr>
+      </w:pPr>
+      <w:r>
+        <w:rPr>
+          <w:rFonts w:hint="default"/>
+          <w:lang w:val="vi-VN"/>
+        </w:rPr>
+        <w:t xml:space="preserve">Phạm Nguyễn Bình An                    </w:t>
+      </w:r>
+      <w:r>
+        <w:rPr>
+          <w:rFonts w:hint="default"/>
+          <w:lang w:val="vi-VN"/>
+        </w:rPr>
         <w:tab/>
+        <w:t>MSSV:</w:t>
+      </w:r>
+    </w:p>
+    <w:p>
+      <w:pPr>
+        <w:bidi w:val="0"/>
+        <w:ind w:left="0" w:leftChars="0" w:firstLine="520" w:firstLineChars="0"/>
+        <w:rPr>
+          <w:rFonts w:hint="default"/>
+          <w:lang w:val="vi-VN"/>
+        </w:rPr>
+      </w:pPr>
+      <w:r>
+        <w:rPr>
+          <w:rFonts w:hint="default"/>
+          <w:lang w:val="vi-VN"/>
+        </w:rPr>
+        <w:t xml:space="preserve">Nguyễn Văn Hùng                        </w:t>
+      </w:r>
+      <w:r>
+        <w:rPr>
+          <w:rFonts w:hint="default"/>
+          <w:lang w:val="vi-VN"/>
+        </w:rPr>
+        <w:tab/>
+        <w:t xml:space="preserve">MSSV:              </w:t>
+      </w:r>
+      <w:r>
+        <w:tab/>
+      </w:r>
+      <w:r>
+        <w:rPr>
+          <w:rFonts w:hint="default"/>
+          <w:lang w:val="vi-VN"/>
+        </w:rPr>
+        <w:t xml:space="preserve">     </w:t>
       </w:r>
       <w:r>
         <w:rPr>
           <w:rFonts w:hint="default"/>
           <w:lang w:val="en-US"/>
         </w:rPr>
-        <w:t xml:space="preserve">                 </w:t>
-      </w:r>
-      <w:r>
-        <w:t>MSSV:</w:t>
+        <w:t xml:space="preserve">     </w:t>
       </w:r>
     </w:p>
     <w:p>
       <w:pPr>
         <w:bidi w:val="0"/>
+        <w:ind w:firstLine="130" w:firstLineChars="50"/>
         <w:rPr>
           <w:rFonts w:hint="default"/>
           <w:lang w:val="vi-VN"/>
@@ -900,63 +895,23 @@
           <w:rFonts w:hint="default"/>
           <w:lang w:val="vi-VN"/>
         </w:rPr>
-        <w:t xml:space="preserve">               </w:t>
+        <w:t xml:space="preserve">      </w:t>
       </w:r>
       <w:r>
         <w:tab/>
       </w:r>
       <w:r>
-        <w:rPr>
-          <w:rFonts w:hint="default"/>
-          <w:lang w:val="vi-VN"/>
-        </w:rPr>
-        <w:t xml:space="preserve">     </w:t>
+        <w:tab/>
+      </w:r>
+      <w:r>
+        <w:tab/>
       </w:r>
       <w:r>
         <w:rPr>
           <w:rFonts w:hint="default"/>
           <w:lang w:val="en-US"/>
         </w:rPr>
-        <w:t xml:space="preserve">            </w:t>
-      </w:r>
-      <w:r>
-        <w:t xml:space="preserve">MSSV: </w:t>
-      </w:r>
-    </w:p>
-    <w:p>
-      <w:pPr>
-        <w:bidi w:val="0"/>
-        <w:ind w:firstLine="130" w:firstLineChars="50"/>
-        <w:rPr>
-          <w:rFonts w:hint="default"/>
-          <w:lang w:val="vi-VN"/>
-        </w:rPr>
-      </w:pPr>
-      <w:r>
-        <w:rPr>
-          <w:rFonts w:hint="default"/>
-          <w:lang w:val="vi-VN"/>
-        </w:rPr>
-        <w:t xml:space="preserve">      </w:t>
-      </w:r>
-      <w:r>
-        <w:tab/>
-      </w:r>
-      <w:r>
-        <w:tab/>
-      </w:r>
-      <w:r>
-        <w:tab/>
-      </w:r>
-      <w:r>
-        <w:rPr>
-          <w:rFonts w:hint="default"/>
-          <w:lang w:val="en-US"/>
-        </w:rPr>
-        <w:t xml:space="preserve">            </w:t>
-      </w:r>
-      <w:r>
-        <w:t xml:space="preserve">MSSV: </w:t>
+        <w:t xml:space="preserve">           </w:t>
       </w:r>
     </w:p>
     <w:p>
@@ -1627,6 +1582,12 @@
             <w:insideH w:val="single" w:color="auto" w:sz="4" w:space="0"/>
             <w:insideV w:val="single" w:color="auto" w:sz="4" w:space="0"/>
           </w:tblBorders>
+          <w:tblCellMar>
+            <w:top w:w="0" w:type="dxa"/>
+            <w:left w:w="108" w:type="dxa"/>
+            <w:bottom w:w="0" w:type="dxa"/>
+            <w:right w:w="108" w:type="dxa"/>
+          </w:tblCellMar>
         </w:tblPrEx>
         <w:tc>
           <w:tcPr>
@@ -1679,7 +1640,7 @@
                 <w:color w:val="000000" w:themeColor="text1"/>
                 <w:sz w:val="26"/>
                 <w:szCs w:val="26"/>
-                <w:lang w:val="en-US"/>
+                <w:lang w:val="vi-VN"/>
                 <w14:textFill>
                   <w14:solidFill>
                     <w14:schemeClr w14:val="tx1"/>
@@ -1693,14 +1654,14 @@
                 <w:color w:val="000000" w:themeColor="text1"/>
                 <w:sz w:val="26"/>
                 <w:szCs w:val="26"/>
-                <w:lang w:val="en-US"/>
+                <w:lang w:val="vi-VN"/>
                 <w14:textFill>
                   <w14:solidFill>
                     <w14:schemeClr w14:val="tx1"/>
                   </w14:solidFill>
                 </w14:textFill>
               </w:rPr>
-              <w:t>Nguyen</w:t>
+              <w:t>Nguyễn Gia Huy</w:t>
             </w:r>
           </w:p>
         </w:tc>
@@ -1866,6 +1827,21 @@
                 </w14:textFill>
               </w:rPr>
             </w:pPr>
+            <w:r>
+              <w:rPr>
+                <w:rFonts w:hint="default" w:cs="Times New Roman"/>
+                <w:color w:val="000000" w:themeColor="text1"/>
+                <w:sz w:val="26"/>
+                <w:szCs w:val="26"/>
+                <w:lang w:val="vi-VN"/>
+                <w14:textFill>
+                  <w14:solidFill>
+                    <w14:schemeClr w14:val="tx1"/>
+                  </w14:solidFill>
+                </w14:textFill>
+              </w:rPr>
+              <w:t>Lê Minh Khang</w:t>
+            </w:r>
           </w:p>
         </w:tc>
         <w:tc>
@@ -2037,6 +2013,21 @@
                 </w14:textFill>
               </w:rPr>
             </w:pPr>
+            <w:r>
+              <w:rPr>
+                <w:rFonts w:hint="default" w:cs="Times New Roman"/>
+                <w:color w:val="000000" w:themeColor="text1"/>
+                <w:sz w:val="26"/>
+                <w:szCs w:val="26"/>
+                <w:lang w:val="vi-VN"/>
+                <w14:textFill>
+                  <w14:solidFill>
+                    <w14:schemeClr w14:val="tx1"/>
+                  </w14:solidFill>
+                </w14:textFill>
+              </w:rPr>
+              <w:t>Trương Văn Hào</w:t>
+            </w:r>
           </w:p>
         </w:tc>
         <w:tc>
@@ -2135,6 +2126,12 @@
             <w:insideH w:val="single" w:color="auto" w:sz="4" w:space="0"/>
             <w:insideV w:val="single" w:color="auto" w:sz="4" w:space="0"/>
           </w:tblBorders>
+          <w:tblCellMar>
+            <w:top w:w="0" w:type="dxa"/>
+            <w:left w:w="108" w:type="dxa"/>
+            <w:bottom w:w="0" w:type="dxa"/>
+            <w:right w:w="108" w:type="dxa"/>
+          </w:tblCellMar>
         </w:tblPrEx>
         <w:trPr>
           <w:trHeight w:val="687" w:hRule="atLeast"/>
@@ -2198,6 +2195,21 @@
                 </w14:textFill>
               </w:rPr>
             </w:pPr>
+            <w:r>
+              <w:rPr>
+                <w:rFonts w:hint="default" w:cs="Times New Roman"/>
+                <w:color w:val="000000" w:themeColor="text1"/>
+                <w:sz w:val="26"/>
+                <w:szCs w:val="26"/>
+                <w:lang w:val="vi-VN"/>
+                <w14:textFill>
+                  <w14:solidFill>
+                    <w14:schemeClr w14:val="tx1"/>
+                  </w14:solidFill>
+                </w14:textFill>
+              </w:rPr>
+              <w:t>Phạm Nguyễn Bình An</w:t>
+            </w:r>
           </w:p>
         </w:tc>
         <w:tc>
@@ -2303,6 +2315,189 @@
           </w:p>
         </w:tc>
       </w:tr>
+      <w:tr>
+        <w:tblPrEx>
+          <w:tblBorders>
+            <w:top w:val="single" w:color="auto" w:sz="4" w:space="0"/>
+            <w:left w:val="single" w:color="auto" w:sz="4" w:space="0"/>
+            <w:bottom w:val="single" w:color="auto" w:sz="4" w:space="0"/>
+            <w:right w:val="single" w:color="auto" w:sz="4" w:space="0"/>
+            <w:insideH w:val="single" w:color="auto" w:sz="4" w:space="0"/>
+            <w:insideV w:val="single" w:color="auto" w:sz="4" w:space="0"/>
+          </w:tblBorders>
+          <w:tblCellMar>
+            <w:top w:w="0" w:type="dxa"/>
+            <w:left w:w="108" w:type="dxa"/>
+            <w:bottom w:w="0" w:type="dxa"/>
+            <w:right w:w="108" w:type="dxa"/>
+          </w:tblCellMar>
+        </w:tblPrEx>
+        <w:trPr>
+          <w:trHeight w:val="687" w:hRule="atLeast"/>
+        </w:trPr>
+        <w:tc>
+          <w:tcPr>
+            <w:tcW w:w="708" w:type="dxa"/>
+          </w:tcPr>
+          <w:p>
+            <w:pPr>
+              <w:spacing w:line="360" w:lineRule="auto"/>
+              <w:jc w:val="center"/>
+              <w:rPr>
+                <w:rFonts w:hint="default" w:ascii="Times New Roman" w:hAnsi="Times New Roman" w:cs="Times New Roman"/>
+                <w:color w:val="000000" w:themeColor="text1"/>
+                <w:sz w:val="26"/>
+                <w:szCs w:val="26"/>
+                <w:lang w:val="vi-VN"/>
+                <w14:textFill>
+                  <w14:solidFill>
+                    <w14:schemeClr w14:val="tx1"/>
+                  </w14:solidFill>
+                </w14:textFill>
+              </w:rPr>
+            </w:pPr>
+            <w:r>
+              <w:rPr>
+                <w:rFonts w:hint="default" w:cs="Times New Roman"/>
+                <w:color w:val="000000" w:themeColor="text1"/>
+                <w:sz w:val="26"/>
+                <w:szCs w:val="26"/>
+                <w:lang w:val="vi-VN"/>
+                <w14:textFill>
+                  <w14:solidFill>
+                    <w14:schemeClr w14:val="tx1"/>
+                  </w14:solidFill>
+                </w14:textFill>
+              </w:rPr>
+              <w:t>6</w:t>
+            </w:r>
+          </w:p>
+        </w:tc>
+        <w:tc>
+          <w:tcPr>
+            <w:tcW w:w="2691" w:type="dxa"/>
+            <w:vAlign w:val="center"/>
+          </w:tcPr>
+          <w:p>
+            <w:pPr>
+              <w:spacing w:line="360" w:lineRule="auto"/>
+              <w:rPr>
+                <w:rFonts w:hint="default" w:cs="Times New Roman"/>
+                <w:color w:val="000000" w:themeColor="text1"/>
+                <w:sz w:val="26"/>
+                <w:szCs w:val="26"/>
+                <w:lang w:val="vi-VN"/>
+                <w14:textFill>
+                  <w14:solidFill>
+                    <w14:schemeClr w14:val="tx1"/>
+                  </w14:solidFill>
+                </w14:textFill>
+              </w:rPr>
+            </w:pPr>
+            <w:r>
+              <w:rPr>
+                <w:rFonts w:hint="default" w:cs="Times New Roman"/>
+                <w:color w:val="000000" w:themeColor="text1"/>
+                <w:sz w:val="26"/>
+                <w:szCs w:val="26"/>
+                <w:lang w:val="vi-VN"/>
+                <w14:textFill>
+                  <w14:solidFill>
+                    <w14:schemeClr w14:val="tx1"/>
+                  </w14:solidFill>
+                </w14:textFill>
+              </w:rPr>
+              <w:t>Nguyễn Văn Hùng</w:t>
+            </w:r>
+          </w:p>
+        </w:tc>
+        <w:tc>
+          <w:tcPr>
+            <w:tcW w:w="1843" w:type="dxa"/>
+            <w:vAlign w:val="center"/>
+          </w:tcPr>
+          <w:p>
+            <w:pPr>
+              <w:spacing w:line="360" w:lineRule="auto"/>
+              <w:jc w:val="center"/>
+              <w:rPr>
+                <w:rFonts w:hint="default" w:ascii="Times New Roman" w:hAnsi="Times New Roman" w:cs="Times New Roman"/>
+                <w:color w:val="000000" w:themeColor="text1"/>
+                <w:sz w:val="26"/>
+                <w:szCs w:val="26"/>
+                <w:lang w:val="vi-VN"/>
+                <w14:textFill>
+                  <w14:solidFill>
+                    <w14:schemeClr w14:val="tx1"/>
+                  </w14:solidFill>
+                </w14:textFill>
+              </w:rPr>
+            </w:pPr>
+          </w:p>
+        </w:tc>
+        <w:tc>
+          <w:tcPr>
+            <w:tcW w:w="3117" w:type="dxa"/>
+            <w:vAlign w:val="center"/>
+          </w:tcPr>
+          <w:p>
+            <w:pPr>
+              <w:bidi w:val="0"/>
+              <w:rPr>
+                <w:rFonts w:ascii="Times New Roman" w:hAnsi="Times New Roman" w:cs="Times New Roman"/>
+                <w:color w:val="000000" w:themeColor="text1"/>
+                <w:sz w:val="26"/>
+                <w:szCs w:val="26"/>
+                <w:lang w:val="vi-VN"/>
+                <w14:textFill>
+                  <w14:solidFill>
+                    <w14:schemeClr w14:val="tx1"/>
+                  </w14:solidFill>
+                </w14:textFill>
+              </w:rPr>
+            </w:pPr>
+          </w:p>
+        </w:tc>
+        <w:tc>
+          <w:tcPr>
+            <w:tcW w:w="1266" w:type="dxa"/>
+            <w:vAlign w:val="center"/>
+          </w:tcPr>
+          <w:p>
+            <w:pPr>
+              <w:spacing w:line="360" w:lineRule="auto"/>
+              <w:jc w:val="center"/>
+              <w:rPr>
+                <w:rFonts w:hint="default" w:ascii="Times New Roman" w:hAnsi="Times New Roman" w:cs="Times New Roman"/>
+                <w:color w:val="000000" w:themeColor="text1"/>
+                <w:sz w:val="26"/>
+                <w:szCs w:val="26"/>
+                <w:lang w:val="vi-VN"/>
+                <w14:textFill>
+                  <w14:solidFill>
+                    <w14:schemeClr w14:val="tx1"/>
+                  </w14:solidFill>
+                </w14:textFill>
+              </w:rPr>
+            </w:pPr>
+            <w:r>
+              <w:rPr>
+                <w:rFonts w:hint="default" w:cs="Times New Roman"/>
+                <w:color w:val="000000" w:themeColor="text1"/>
+                <w:sz w:val="26"/>
+                <w:szCs w:val="26"/>
+                <w:lang w:val="vi-VN"/>
+                <w14:textFill>
+                  <w14:solidFill>
+                    <w14:schemeClr w14:val="tx1"/>
+                  </w14:solidFill>
+                </w14:textFill>
+              </w:rPr>
+              <w:t>100%</w:t>
+            </w:r>
+          </w:p>
+        </w:tc>
+      </w:tr>
     </w:tbl>
     <w:p>
       <w:pPr>
@@ -2370,9 +2565,9 @@
           </w14:textFill>
         </w:rPr>
       </w:pPr>
-      <w:bookmarkStart w:id="0" w:name="_Toc8510"/>
-      <w:bookmarkStart w:id="1" w:name="_Toc7338"/>
-      <w:bookmarkStart w:id="2" w:name="_Toc219926457"/>
+      <w:bookmarkStart w:id="0" w:name="_Toc7338"/>
+      <w:bookmarkStart w:id="1" w:name="_Toc219926457"/>
+      <w:bookmarkStart w:id="2" w:name="_Toc8510"/>
       <w:r>
         <w:rPr>
           <w:rFonts w:ascii="Times New Roman" w:hAnsi="Times New Roman" w:cs="Times New Roman"/>
@@ -2396,17 +2591,13 @@
     </w:p>
     <w:p>
       <w:pPr>
-        <w:spacing w:line="360" w:lineRule="auto"/>
-        <w:ind w:firstLine="720"/>
-        <w:jc w:val="both"/>
-        <w:rPr>
-          <w:rFonts w:ascii="Times New Roman" w:hAnsi="Times New Roman" w:cs="Times New Roman"/>
+        <w:bidi w:val="0"/>
+        <w:rPr>
           <w:lang w:val="en-US"/>
         </w:rPr>
       </w:pPr>
       <w:r>
         <w:rPr>
-          <w:rFonts w:ascii="Times New Roman" w:hAnsi="Times New Roman" w:cs="Times New Roman"/>
           <w:lang w:val="en-US"/>
         </w:rPr>
         <w:t>Trong quá trình thực hiện báo cáo bài tập lớn học phần, nhóm chúng em đã nhận được rất nhiều sự quan tâm, hướng dẫn và hỗ trợ quý báu từ phía giảng viên, nhà trường cũng như các bạn trong nhóm.</w:t>
@@ -2552,6 +2743,788 @@
     </w:p>
     <w:p>
       <w:pPr>
+        <w:spacing w:before="0" w:beforeLines="0" w:after="0" w:afterLines="0" w:line="240" w:lineRule="auto"/>
+        <w:ind w:left="0" w:leftChars="0" w:right="0" w:rightChars="0" w:firstLine="0" w:firstLineChars="0"/>
+        <w:jc w:val="both"/>
+      </w:pPr>
+    </w:p>
+    <w:p>
+      <w:pPr>
+        <w:spacing w:before="0" w:beforeLines="0" w:after="0" w:afterLines="0" w:line="240" w:lineRule="auto"/>
+        <w:ind w:left="0" w:leftChars="0" w:right="0" w:rightChars="0" w:firstLine="0" w:firstLineChars="0"/>
+        <w:jc w:val="both"/>
+      </w:pPr>
+    </w:p>
+    <w:p>
+      <w:pPr>
+        <w:spacing w:before="0" w:beforeLines="0" w:after="0" w:afterLines="0" w:line="240" w:lineRule="auto"/>
+        <w:ind w:left="0" w:leftChars="0" w:right="0" w:rightChars="0" w:firstLine="0" w:firstLineChars="0"/>
+        <w:jc w:val="both"/>
+      </w:pPr>
+    </w:p>
+    <w:p>
+      <w:pPr>
+        <w:spacing w:before="0" w:beforeLines="0" w:after="0" w:afterLines="0" w:line="240" w:lineRule="auto"/>
+        <w:ind w:left="0" w:leftChars="0" w:right="0" w:rightChars="0" w:firstLine="0" w:firstLineChars="0"/>
+        <w:jc w:val="both"/>
+      </w:pPr>
+    </w:p>
+    <w:p>
+      <w:pPr>
+        <w:spacing w:before="0" w:beforeLines="0" w:after="0" w:afterLines="0" w:line="240" w:lineRule="auto"/>
+        <w:ind w:left="0" w:leftChars="0" w:right="0" w:rightChars="0" w:firstLine="0" w:firstLineChars="0"/>
+        <w:jc w:val="both"/>
+      </w:pPr>
+    </w:p>
+    <w:p>
+      <w:pPr>
+        <w:spacing w:before="0" w:beforeLines="0" w:after="0" w:afterLines="0" w:line="240" w:lineRule="auto"/>
+        <w:ind w:left="0" w:leftChars="0" w:right="0" w:rightChars="0" w:firstLine="0" w:firstLineChars="0"/>
+        <w:jc w:val="both"/>
+      </w:pPr>
+    </w:p>
+    <w:p>
+      <w:pPr>
+        <w:spacing w:before="0" w:beforeLines="0" w:after="0" w:afterLines="0" w:line="240" w:lineRule="auto"/>
+        <w:ind w:left="0" w:leftChars="0" w:right="0" w:rightChars="0" w:firstLine="0" w:firstLineChars="0"/>
+        <w:jc w:val="both"/>
+      </w:pPr>
+    </w:p>
+    <w:p>
+      <w:pPr>
+        <w:spacing w:before="0" w:beforeLines="0" w:after="0" w:afterLines="0" w:line="240" w:lineRule="auto"/>
+        <w:ind w:left="0" w:leftChars="0" w:right="0" w:rightChars="0" w:firstLine="0" w:firstLineChars="0"/>
+        <w:jc w:val="both"/>
+      </w:pPr>
+    </w:p>
+    <w:p>
+      <w:pPr>
+        <w:spacing w:before="0" w:beforeLines="0" w:after="0" w:afterLines="0" w:line="240" w:lineRule="auto"/>
+        <w:ind w:left="0" w:leftChars="0" w:right="0" w:rightChars="0" w:firstLine="0" w:firstLineChars="0"/>
+        <w:jc w:val="both"/>
+      </w:pPr>
+    </w:p>
+    <w:p>
+      <w:pPr>
+        <w:spacing w:before="0" w:beforeLines="0" w:after="0" w:afterLines="0" w:line="240" w:lineRule="auto"/>
+        <w:ind w:left="0" w:leftChars="0" w:right="0" w:rightChars="0" w:firstLine="0" w:firstLineChars="0"/>
+        <w:jc w:val="both"/>
+      </w:pPr>
+    </w:p>
+    <w:p>
+      <w:pPr>
+        <w:spacing w:before="0" w:beforeLines="0" w:after="0" w:afterLines="0" w:line="240" w:lineRule="auto"/>
+        <w:ind w:left="0" w:leftChars="0" w:right="0" w:rightChars="0" w:firstLine="0" w:firstLineChars="0"/>
+        <w:jc w:val="both"/>
+      </w:pPr>
+    </w:p>
+    <w:p>
+      <w:pPr>
+        <w:spacing w:before="0" w:beforeLines="0" w:after="0" w:afterLines="0" w:line="240" w:lineRule="auto"/>
+        <w:ind w:left="0" w:leftChars="0" w:right="0" w:rightChars="0" w:firstLine="0" w:firstLineChars="0"/>
+        <w:jc w:val="both"/>
+      </w:pPr>
+    </w:p>
+    <w:p>
+      <w:pPr>
+        <w:spacing w:before="0" w:beforeLines="0" w:after="0" w:afterLines="0" w:line="240" w:lineRule="auto"/>
+        <w:ind w:left="0" w:leftChars="0" w:right="0" w:rightChars="0" w:firstLine="0" w:firstLineChars="0"/>
+        <w:jc w:val="both"/>
+      </w:pPr>
+    </w:p>
+    <w:p>
+      <w:pPr>
+        <w:spacing w:before="0" w:beforeLines="0" w:after="0" w:afterLines="0" w:line="240" w:lineRule="auto"/>
+        <w:ind w:left="0" w:leftChars="0" w:right="0" w:rightChars="0" w:firstLine="0" w:firstLineChars="0"/>
+        <w:jc w:val="both"/>
+      </w:pPr>
+    </w:p>
+    <w:p>
+      <w:pPr>
+        <w:spacing w:before="0" w:beforeLines="0" w:after="0" w:afterLines="0" w:line="240" w:lineRule="auto"/>
+        <w:ind w:left="0" w:leftChars="0" w:right="0" w:rightChars="0" w:firstLine="0" w:firstLineChars="0"/>
+        <w:jc w:val="both"/>
+      </w:pPr>
+    </w:p>
+    <w:p>
+      <w:pPr>
+        <w:spacing w:before="0" w:beforeLines="0" w:after="0" w:afterLines="0" w:line="240" w:lineRule="auto"/>
+        <w:ind w:left="0" w:leftChars="0" w:right="0" w:rightChars="0" w:firstLine="0" w:firstLineChars="0"/>
+        <w:jc w:val="both"/>
+      </w:pPr>
+    </w:p>
+    <w:p>
+      <w:pPr>
+        <w:spacing w:before="0" w:beforeLines="0" w:after="0" w:afterLines="0" w:line="240" w:lineRule="auto"/>
+        <w:ind w:left="0" w:leftChars="0" w:right="0" w:rightChars="0" w:firstLine="0" w:firstLineChars="0"/>
+        <w:jc w:val="both"/>
+      </w:pPr>
+    </w:p>
+    <w:p>
+      <w:pPr>
+        <w:spacing w:before="0" w:beforeLines="0" w:after="0" w:afterLines="0" w:line="240" w:lineRule="auto"/>
+        <w:ind w:left="0" w:leftChars="0" w:right="0" w:rightChars="0" w:firstLine="0" w:firstLineChars="0"/>
+        <w:jc w:val="both"/>
+      </w:pPr>
+    </w:p>
+    <w:p>
+      <w:pPr>
+        <w:spacing w:before="0" w:beforeLines="0" w:after="0" w:afterLines="0" w:line="240" w:lineRule="auto"/>
+        <w:ind w:left="0" w:leftChars="0" w:right="0" w:rightChars="0" w:firstLine="0" w:firstLineChars="0"/>
+        <w:jc w:val="both"/>
+      </w:pPr>
+    </w:p>
+    <w:p>
+      <w:pPr>
+        <w:spacing w:before="0" w:beforeLines="0" w:after="0" w:afterLines="0" w:line="240" w:lineRule="auto"/>
+        <w:ind w:left="0" w:leftChars="0" w:right="0" w:rightChars="0" w:firstLine="0" w:firstLineChars="0"/>
+        <w:jc w:val="both"/>
+      </w:pPr>
+    </w:p>
+    <w:p>
+      <w:pPr>
+        <w:spacing w:before="0" w:beforeLines="0" w:after="0" w:afterLines="0" w:line="240" w:lineRule="auto"/>
+        <w:ind w:left="0" w:leftChars="0" w:right="0" w:rightChars="0" w:firstLine="0" w:firstLineChars="0"/>
+        <w:jc w:val="both"/>
+      </w:pPr>
+    </w:p>
+    <w:p>
+      <w:pPr>
+        <w:spacing w:before="0" w:beforeLines="0" w:after="0" w:afterLines="0" w:line="240" w:lineRule="auto"/>
+        <w:ind w:left="0" w:leftChars="0" w:right="0" w:rightChars="0" w:firstLine="0" w:firstLineChars="0"/>
+        <w:jc w:val="both"/>
+      </w:pPr>
+    </w:p>
+    <w:p>
+      <w:pPr>
+        <w:spacing w:before="0" w:beforeLines="0" w:after="0" w:afterLines="0" w:line="240" w:lineRule="auto"/>
+        <w:ind w:left="0" w:leftChars="0" w:right="0" w:rightChars="0" w:firstLine="0" w:firstLineChars="0"/>
+        <w:jc w:val="both"/>
+      </w:pPr>
+    </w:p>
+    <w:p>
+      <w:pPr>
+        <w:spacing w:before="0" w:beforeLines="0" w:after="0" w:afterLines="0" w:line="240" w:lineRule="auto"/>
+        <w:ind w:left="0" w:leftChars="0" w:right="0" w:rightChars="0" w:firstLine="0" w:firstLineChars="0"/>
+        <w:jc w:val="both"/>
+      </w:pPr>
+    </w:p>
+    <w:p>
+      <w:pPr>
+        <w:spacing w:before="0" w:beforeLines="0" w:after="0" w:afterLines="0" w:line="240" w:lineRule="auto"/>
+        <w:ind w:left="0" w:leftChars="0" w:right="0" w:rightChars="0" w:firstLine="0" w:firstLineChars="0"/>
+        <w:jc w:val="both"/>
+      </w:pPr>
+    </w:p>
+    <w:p>
+      <w:pPr>
+        <w:spacing w:before="0" w:beforeLines="0" w:after="0" w:afterLines="0" w:line="240" w:lineRule="auto"/>
+        <w:ind w:left="0" w:leftChars="0" w:right="0" w:rightChars="0" w:firstLine="0" w:firstLineChars="0"/>
+        <w:jc w:val="both"/>
+      </w:pPr>
+    </w:p>
+    <w:p>
+      <w:pPr>
+        <w:spacing w:before="0" w:beforeLines="0" w:after="0" w:afterLines="0" w:line="240" w:lineRule="auto"/>
+        <w:ind w:left="0" w:leftChars="0" w:right="0" w:rightChars="0" w:firstLine="0" w:firstLineChars="0"/>
+        <w:jc w:val="both"/>
+      </w:pPr>
+    </w:p>
+    <w:p>
+      <w:pPr>
+        <w:spacing w:before="0" w:beforeLines="0" w:after="0" w:afterLines="0" w:line="240" w:lineRule="auto"/>
+        <w:ind w:left="0" w:leftChars="0" w:right="0" w:rightChars="0" w:firstLine="0" w:firstLineChars="0"/>
+        <w:jc w:val="both"/>
+      </w:pPr>
+    </w:p>
+    <w:p>
+      <w:pPr>
+        <w:spacing w:before="0" w:beforeLines="0" w:after="0" w:afterLines="0" w:line="240" w:lineRule="auto"/>
+        <w:ind w:left="0" w:leftChars="0" w:right="0" w:rightChars="0" w:firstLine="0" w:firstLineChars="0"/>
+        <w:jc w:val="both"/>
+      </w:pPr>
+    </w:p>
+    <w:p>
+      <w:pPr>
+        <w:spacing w:before="0" w:beforeLines="0" w:after="0" w:afterLines="0" w:line="240" w:lineRule="auto"/>
+        <w:ind w:left="0" w:leftChars="0" w:right="0" w:rightChars="0" w:firstLine="0" w:firstLineChars="0"/>
+        <w:jc w:val="both"/>
+      </w:pPr>
+    </w:p>
+    <w:p>
+      <w:pPr>
+        <w:spacing w:before="0" w:beforeLines="0" w:after="0" w:afterLines="0" w:line="240" w:lineRule="auto"/>
+        <w:ind w:left="0" w:leftChars="0" w:right="0" w:rightChars="0" w:firstLine="0" w:firstLineChars="0"/>
+        <w:jc w:val="both"/>
+      </w:pPr>
+    </w:p>
+    <w:p>
+      <w:pPr>
+        <w:spacing w:before="0" w:beforeLines="0" w:after="0" w:afterLines="0" w:line="240" w:lineRule="auto"/>
+        <w:ind w:left="0" w:leftChars="0" w:right="0" w:rightChars="0" w:firstLine="0" w:firstLineChars="0"/>
+        <w:jc w:val="both"/>
+      </w:pPr>
+    </w:p>
+    <w:p>
+      <w:pPr>
+        <w:spacing w:before="0" w:beforeLines="0" w:after="0" w:afterLines="0" w:line="240" w:lineRule="auto"/>
+        <w:ind w:left="0" w:leftChars="0" w:right="0" w:rightChars="0" w:firstLine="0" w:firstLineChars="0"/>
+        <w:jc w:val="both"/>
+      </w:pPr>
+    </w:p>
+    <w:p>
+      <w:pPr>
+        <w:spacing w:before="0" w:beforeLines="0" w:after="0" w:afterLines="0" w:line="240" w:lineRule="auto"/>
+        <w:ind w:left="0" w:leftChars="0" w:right="0" w:rightChars="0" w:firstLine="0" w:firstLineChars="0"/>
+        <w:jc w:val="both"/>
+      </w:pPr>
+    </w:p>
+    <w:p>
+      <w:pPr>
+        <w:spacing w:before="0" w:beforeLines="0" w:after="0" w:afterLines="0" w:line="240" w:lineRule="auto"/>
+        <w:ind w:left="0" w:leftChars="0" w:right="0" w:rightChars="0" w:firstLine="0" w:firstLineChars="0"/>
+        <w:jc w:val="both"/>
+      </w:pPr>
+    </w:p>
+    <w:p>
+      <w:pPr>
+        <w:spacing w:before="0" w:beforeLines="0" w:after="0" w:afterLines="0" w:line="240" w:lineRule="auto"/>
+        <w:ind w:left="0" w:leftChars="0" w:right="0" w:rightChars="0" w:firstLine="0" w:firstLineChars="0"/>
+        <w:jc w:val="both"/>
+      </w:pPr>
+    </w:p>
+    <w:p>
+      <w:pPr>
+        <w:spacing w:before="0" w:beforeLines="0" w:after="0" w:afterLines="0" w:line="240" w:lineRule="auto"/>
+        <w:ind w:left="0" w:leftChars="0" w:right="0" w:rightChars="0" w:firstLine="0" w:firstLineChars="0"/>
+        <w:jc w:val="both"/>
+      </w:pPr>
+    </w:p>
+    <w:p>
+      <w:pPr>
+        <w:spacing w:before="0" w:beforeLines="0" w:after="0" w:afterLines="0" w:line="240" w:lineRule="auto"/>
+        <w:ind w:left="0" w:leftChars="0" w:right="0" w:rightChars="0" w:firstLine="0" w:firstLineChars="0"/>
+        <w:jc w:val="both"/>
+      </w:pPr>
+    </w:p>
+    <w:p>
+      <w:pPr>
+        <w:spacing w:before="0" w:beforeLines="0" w:after="0" w:afterLines="0" w:line="240" w:lineRule="auto"/>
+        <w:ind w:left="0" w:leftChars="0" w:right="0" w:rightChars="0" w:firstLine="0" w:firstLineChars="0"/>
+        <w:jc w:val="both"/>
+      </w:pPr>
+    </w:p>
+    <w:p>
+      <w:pPr>
+        <w:spacing w:before="0" w:beforeLines="0" w:after="0" w:afterLines="0" w:line="240" w:lineRule="auto"/>
+        <w:ind w:left="0" w:leftChars="0" w:right="0" w:rightChars="0" w:firstLine="0" w:firstLineChars="0"/>
+        <w:jc w:val="both"/>
+      </w:pPr>
+    </w:p>
+    <w:p>
+      <w:pPr>
+        <w:spacing w:before="0" w:beforeLines="0" w:after="0" w:afterLines="0" w:line="240" w:lineRule="auto"/>
+        <w:ind w:left="0" w:leftChars="0" w:right="0" w:rightChars="0" w:firstLine="0" w:firstLineChars="0"/>
+        <w:jc w:val="both"/>
+      </w:pPr>
+    </w:p>
+    <w:p>
+      <w:pPr>
+        <w:spacing w:before="0" w:beforeLines="0" w:after="0" w:afterLines="0" w:line="240" w:lineRule="auto"/>
+        <w:ind w:left="0" w:leftChars="0" w:right="0" w:rightChars="0" w:firstLine="0" w:firstLineChars="0"/>
+        <w:jc w:val="both"/>
+      </w:pPr>
+    </w:p>
+    <w:p>
+      <w:pPr>
+        <w:spacing w:before="0" w:beforeLines="0" w:after="0" w:afterLines="0" w:line="240" w:lineRule="auto"/>
+        <w:ind w:left="0" w:leftChars="0" w:right="0" w:rightChars="0" w:firstLine="0" w:firstLineChars="0"/>
+        <w:jc w:val="both"/>
+      </w:pPr>
+    </w:p>
+    <w:p>
+      <w:pPr>
+        <w:spacing w:before="0" w:beforeLines="0" w:after="0" w:afterLines="0" w:line="240" w:lineRule="auto"/>
+        <w:ind w:left="0" w:leftChars="0" w:right="0" w:rightChars="0" w:firstLine="0" w:firstLineChars="0"/>
+        <w:jc w:val="both"/>
+      </w:pPr>
+    </w:p>
+    <w:p>
+      <w:pPr>
+        <w:spacing w:before="0" w:beforeLines="0" w:after="0" w:afterLines="0" w:line="240" w:lineRule="auto"/>
+        <w:ind w:left="0" w:leftChars="0" w:right="0" w:rightChars="0" w:firstLine="0" w:firstLineChars="0"/>
+        <w:jc w:val="both"/>
+      </w:pPr>
+    </w:p>
+    <w:p>
+      <w:pPr>
+        <w:pStyle w:val="2"/>
+        <w:bidi w:val="0"/>
+        <w:rPr>
+          <w:rFonts w:hint="default"/>
+          <w:lang w:val="vi-VN"/>
+        </w:rPr>
+      </w:pPr>
+      <w:r>
+        <w:rPr>
+          <w:rFonts w:hint="default"/>
+          <w:lang w:val="vi-VN"/>
+        </w:rPr>
+        <w:t>CHƯƠNG 1: TỔNG QUANG VỀ ĐỀ TÀI</w:t>
+      </w:r>
+      <w:bookmarkStart w:id="6" w:name="_GoBack"/>
+      <w:bookmarkEnd w:id="6"/>
+    </w:p>
+    <w:p>
+      <w:pPr>
+        <w:spacing w:before="0" w:beforeLines="0" w:after="0" w:afterLines="0" w:line="240" w:lineRule="auto"/>
+        <w:ind w:left="0" w:leftChars="0" w:right="0" w:rightChars="0" w:firstLine="0" w:firstLineChars="0"/>
+        <w:jc w:val="both"/>
+      </w:pPr>
+    </w:p>
+    <w:p>
+      <w:pPr>
+        <w:spacing w:before="0" w:beforeLines="0" w:after="0" w:afterLines="0" w:line="240" w:lineRule="auto"/>
+        <w:ind w:left="0" w:leftChars="0" w:right="0" w:rightChars="0" w:firstLine="0" w:firstLineChars="0"/>
+        <w:jc w:val="both"/>
+      </w:pPr>
+    </w:p>
+    <w:p>
+      <w:pPr>
+        <w:spacing w:before="0" w:beforeLines="0" w:after="0" w:afterLines="0" w:line="240" w:lineRule="auto"/>
+        <w:ind w:left="0" w:leftChars="0" w:right="0" w:rightChars="0" w:firstLine="0" w:firstLineChars="0"/>
+        <w:jc w:val="both"/>
+      </w:pPr>
+    </w:p>
+    <w:p>
+      <w:pPr>
+        <w:spacing w:before="0" w:beforeLines="0" w:after="0" w:afterLines="0" w:line="240" w:lineRule="auto"/>
+        <w:ind w:left="0" w:leftChars="0" w:right="0" w:rightChars="0" w:firstLine="0" w:firstLineChars="0"/>
+        <w:jc w:val="both"/>
+      </w:pPr>
+    </w:p>
+    <w:p>
+      <w:pPr>
+        <w:spacing w:before="0" w:beforeLines="0" w:after="0" w:afterLines="0" w:line="240" w:lineRule="auto"/>
+        <w:ind w:left="0" w:leftChars="0" w:right="0" w:rightChars="0" w:firstLine="0" w:firstLineChars="0"/>
+        <w:jc w:val="both"/>
+      </w:pPr>
+    </w:p>
+    <w:p>
+      <w:pPr>
+        <w:spacing w:before="0" w:beforeLines="0" w:after="0" w:afterLines="0" w:line="240" w:lineRule="auto"/>
+        <w:ind w:left="0" w:leftChars="0" w:right="0" w:rightChars="0" w:firstLine="0" w:firstLineChars="0"/>
+        <w:jc w:val="both"/>
+      </w:pPr>
+    </w:p>
+    <w:p>
+      <w:pPr>
+        <w:spacing w:before="0" w:beforeLines="0" w:after="0" w:afterLines="0" w:line="240" w:lineRule="auto"/>
+        <w:ind w:left="0" w:leftChars="0" w:right="0" w:rightChars="0" w:firstLine="0" w:firstLineChars="0"/>
+        <w:jc w:val="both"/>
+      </w:pPr>
+    </w:p>
+    <w:p>
+      <w:pPr>
+        <w:spacing w:before="0" w:beforeLines="0" w:after="0" w:afterLines="0" w:line="240" w:lineRule="auto"/>
+        <w:ind w:left="0" w:leftChars="0" w:right="0" w:rightChars="0" w:firstLine="0" w:firstLineChars="0"/>
+        <w:jc w:val="both"/>
+      </w:pPr>
+    </w:p>
+    <w:p>
+      <w:pPr>
+        <w:spacing w:before="0" w:beforeLines="0" w:after="0" w:afterLines="0" w:line="240" w:lineRule="auto"/>
+        <w:ind w:left="0" w:leftChars="0" w:right="0" w:rightChars="0" w:firstLine="0" w:firstLineChars="0"/>
+        <w:jc w:val="both"/>
+      </w:pPr>
+    </w:p>
+    <w:p>
+      <w:pPr>
+        <w:spacing w:before="0" w:beforeLines="0" w:after="0" w:afterLines="0" w:line="240" w:lineRule="auto"/>
+        <w:ind w:left="0" w:leftChars="0" w:right="0" w:rightChars="0" w:firstLine="0" w:firstLineChars="0"/>
+        <w:jc w:val="both"/>
+      </w:pPr>
+    </w:p>
+    <w:p>
+      <w:pPr>
+        <w:spacing w:before="0" w:beforeLines="0" w:after="0" w:afterLines="0" w:line="240" w:lineRule="auto"/>
+        <w:ind w:left="0" w:leftChars="0" w:right="0" w:rightChars="0" w:firstLine="0" w:firstLineChars="0"/>
+        <w:jc w:val="both"/>
+      </w:pPr>
+    </w:p>
+    <w:p>
+      <w:pPr>
+        <w:spacing w:before="0" w:beforeLines="0" w:after="0" w:afterLines="0" w:line="240" w:lineRule="auto"/>
+        <w:ind w:left="0" w:leftChars="0" w:right="0" w:rightChars="0" w:firstLine="0" w:firstLineChars="0"/>
+        <w:jc w:val="both"/>
+      </w:pPr>
+    </w:p>
+    <w:p>
+      <w:pPr>
+        <w:spacing w:before="0" w:beforeLines="0" w:after="0" w:afterLines="0" w:line="240" w:lineRule="auto"/>
+        <w:ind w:left="0" w:leftChars="0" w:right="0" w:rightChars="0" w:firstLine="0" w:firstLineChars="0"/>
+        <w:jc w:val="both"/>
+      </w:pPr>
+    </w:p>
+    <w:p>
+      <w:pPr>
+        <w:spacing w:before="0" w:beforeLines="0" w:after="0" w:afterLines="0" w:line="240" w:lineRule="auto"/>
+        <w:ind w:left="0" w:leftChars="0" w:right="0" w:rightChars="0" w:firstLine="0" w:firstLineChars="0"/>
+        <w:jc w:val="both"/>
+      </w:pPr>
+    </w:p>
+    <w:p>
+      <w:pPr>
+        <w:spacing w:before="0" w:beforeLines="0" w:after="0" w:afterLines="0" w:line="240" w:lineRule="auto"/>
+        <w:ind w:left="0" w:leftChars="0" w:right="0" w:rightChars="0" w:firstLine="0" w:firstLineChars="0"/>
+        <w:jc w:val="both"/>
+      </w:pPr>
+    </w:p>
+    <w:p>
+      <w:pPr>
+        <w:spacing w:before="0" w:beforeLines="0" w:after="0" w:afterLines="0" w:line="240" w:lineRule="auto"/>
+        <w:ind w:left="0" w:leftChars="0" w:right="0" w:rightChars="0" w:firstLine="0" w:firstLineChars="0"/>
+        <w:jc w:val="both"/>
+      </w:pPr>
+    </w:p>
+    <w:p>
+      <w:pPr>
+        <w:spacing w:before="0" w:beforeLines="0" w:after="0" w:afterLines="0" w:line="240" w:lineRule="auto"/>
+        <w:ind w:left="0" w:leftChars="0" w:right="0" w:rightChars="0" w:firstLine="0" w:firstLineChars="0"/>
+        <w:jc w:val="both"/>
+      </w:pPr>
+    </w:p>
+    <w:p>
+      <w:pPr>
+        <w:spacing w:before="0" w:beforeLines="0" w:after="0" w:afterLines="0" w:line="240" w:lineRule="auto"/>
+        <w:ind w:left="0" w:leftChars="0" w:right="0" w:rightChars="0" w:firstLine="0" w:firstLineChars="0"/>
+        <w:jc w:val="both"/>
+      </w:pPr>
+    </w:p>
+    <w:p>
+      <w:pPr>
+        <w:spacing w:before="0" w:beforeLines="0" w:after="0" w:afterLines="0" w:line="240" w:lineRule="auto"/>
+        <w:ind w:left="0" w:leftChars="0" w:right="0" w:rightChars="0" w:firstLine="0" w:firstLineChars="0"/>
+        <w:jc w:val="both"/>
+      </w:pPr>
+    </w:p>
+    <w:p>
+      <w:pPr>
+        <w:spacing w:before="0" w:beforeLines="0" w:after="0" w:afterLines="0" w:line="240" w:lineRule="auto"/>
+        <w:ind w:left="0" w:leftChars="0" w:right="0" w:rightChars="0" w:firstLine="0" w:firstLineChars="0"/>
+        <w:jc w:val="both"/>
+      </w:pPr>
+    </w:p>
+    <w:p>
+      <w:pPr>
+        <w:spacing w:before="0" w:beforeLines="0" w:after="0" w:afterLines="0" w:line="240" w:lineRule="auto"/>
+        <w:ind w:left="0" w:leftChars="0" w:right="0" w:rightChars="0" w:firstLine="0" w:firstLineChars="0"/>
+        <w:jc w:val="both"/>
+      </w:pPr>
+    </w:p>
+    <w:p>
+      <w:pPr>
+        <w:spacing w:before="0" w:beforeLines="0" w:after="0" w:afterLines="0" w:line="240" w:lineRule="auto"/>
+        <w:ind w:left="0" w:leftChars="0" w:right="0" w:rightChars="0" w:firstLine="0" w:firstLineChars="0"/>
+        <w:jc w:val="both"/>
+      </w:pPr>
+    </w:p>
+    <w:p>
+      <w:pPr>
+        <w:spacing w:before="0" w:beforeLines="0" w:after="0" w:afterLines="0" w:line="240" w:lineRule="auto"/>
+        <w:ind w:left="0" w:leftChars="0" w:right="0" w:rightChars="0" w:firstLine="0" w:firstLineChars="0"/>
+        <w:jc w:val="both"/>
+      </w:pPr>
+    </w:p>
+    <w:p>
+      <w:pPr>
+        <w:spacing w:before="0" w:beforeLines="0" w:after="0" w:afterLines="0" w:line="240" w:lineRule="auto"/>
+        <w:ind w:left="0" w:leftChars="0" w:right="0" w:rightChars="0" w:firstLine="0" w:firstLineChars="0"/>
+        <w:jc w:val="both"/>
+      </w:pPr>
+    </w:p>
+    <w:p>
+      <w:pPr>
+        <w:spacing w:before="0" w:beforeLines="0" w:after="0" w:afterLines="0" w:line="240" w:lineRule="auto"/>
+        <w:ind w:left="0" w:leftChars="0" w:right="0" w:rightChars="0" w:firstLine="0" w:firstLineChars="0"/>
+        <w:jc w:val="both"/>
+      </w:pPr>
+    </w:p>
+    <w:p>
+      <w:pPr>
+        <w:spacing w:before="0" w:beforeLines="0" w:after="0" w:afterLines="0" w:line="240" w:lineRule="auto"/>
+        <w:ind w:left="0" w:leftChars="0" w:right="0" w:rightChars="0" w:firstLine="0" w:firstLineChars="0"/>
+        <w:jc w:val="both"/>
+      </w:pPr>
+    </w:p>
+    <w:p>
+      <w:pPr>
+        <w:spacing w:before="0" w:beforeLines="0" w:after="0" w:afterLines="0" w:line="240" w:lineRule="auto"/>
+        <w:ind w:left="0" w:leftChars="0" w:right="0" w:rightChars="0" w:firstLine="0" w:firstLineChars="0"/>
+        <w:jc w:val="both"/>
+      </w:pPr>
+    </w:p>
+    <w:p>
+      <w:pPr>
+        <w:spacing w:before="0" w:beforeLines="0" w:after="0" w:afterLines="0" w:line="240" w:lineRule="auto"/>
+        <w:ind w:left="0" w:leftChars="0" w:right="0" w:rightChars="0" w:firstLine="0" w:firstLineChars="0"/>
+        <w:jc w:val="both"/>
+      </w:pPr>
+    </w:p>
+    <w:p>
+      <w:pPr>
+        <w:spacing w:before="0" w:beforeLines="0" w:after="0" w:afterLines="0" w:line="240" w:lineRule="auto"/>
+        <w:ind w:left="0" w:leftChars="0" w:right="0" w:rightChars="0" w:firstLine="0" w:firstLineChars="0"/>
+        <w:jc w:val="both"/>
+      </w:pPr>
+    </w:p>
+    <w:p>
+      <w:pPr>
+        <w:spacing w:before="0" w:beforeLines="0" w:after="0" w:afterLines="0" w:line="240" w:lineRule="auto"/>
+        <w:ind w:left="0" w:leftChars="0" w:right="0" w:rightChars="0" w:firstLine="0" w:firstLineChars="0"/>
+        <w:jc w:val="both"/>
+      </w:pPr>
+    </w:p>
+    <w:p>
+      <w:pPr>
+        <w:spacing w:before="0" w:beforeLines="0" w:after="0" w:afterLines="0" w:line="240" w:lineRule="auto"/>
+        <w:ind w:left="0" w:leftChars="0" w:right="0" w:rightChars="0" w:firstLine="0" w:firstLineChars="0"/>
+        <w:jc w:val="both"/>
+      </w:pPr>
+    </w:p>
+    <w:p>
+      <w:pPr>
+        <w:spacing w:before="0" w:beforeLines="0" w:after="0" w:afterLines="0" w:line="240" w:lineRule="auto"/>
+        <w:ind w:left="0" w:leftChars="0" w:right="0" w:rightChars="0" w:firstLine="0" w:firstLineChars="0"/>
+        <w:jc w:val="both"/>
+      </w:pPr>
+    </w:p>
+    <w:p>
+      <w:pPr>
+        <w:spacing w:before="0" w:beforeLines="0" w:after="0" w:afterLines="0" w:line="240" w:lineRule="auto"/>
+        <w:ind w:left="0" w:leftChars="0" w:right="0" w:rightChars="0" w:firstLine="0" w:firstLineChars="0"/>
+        <w:jc w:val="both"/>
+      </w:pPr>
+    </w:p>
+    <w:p>
+      <w:pPr>
+        <w:spacing w:before="0" w:beforeLines="0" w:after="0" w:afterLines="0" w:line="240" w:lineRule="auto"/>
+        <w:ind w:left="0" w:leftChars="0" w:right="0" w:rightChars="0" w:firstLine="0" w:firstLineChars="0"/>
+        <w:jc w:val="both"/>
+      </w:pPr>
+    </w:p>
+    <w:p>
+      <w:pPr>
+        <w:spacing w:before="0" w:beforeLines="0" w:after="0" w:afterLines="0" w:line="240" w:lineRule="auto"/>
+        <w:ind w:left="0" w:leftChars="0" w:right="0" w:rightChars="0" w:firstLine="0" w:firstLineChars="0"/>
+        <w:jc w:val="both"/>
+      </w:pPr>
+    </w:p>
+    <w:p>
+      <w:pPr>
+        <w:spacing w:before="0" w:beforeLines="0" w:after="0" w:afterLines="0" w:line="240" w:lineRule="auto"/>
+        <w:ind w:left="0" w:leftChars="0" w:right="0" w:rightChars="0" w:firstLine="0" w:firstLineChars="0"/>
+        <w:jc w:val="both"/>
+      </w:pPr>
+    </w:p>
+    <w:p>
+      <w:pPr>
+        <w:spacing w:before="0" w:beforeLines="0" w:after="0" w:afterLines="0" w:line="240" w:lineRule="auto"/>
+        <w:ind w:left="0" w:leftChars="0" w:right="0" w:rightChars="0" w:firstLine="0" w:firstLineChars="0"/>
+        <w:jc w:val="both"/>
+      </w:pPr>
+    </w:p>
+    <w:p>
+      <w:pPr>
+        <w:spacing w:before="0" w:beforeLines="0" w:after="0" w:afterLines="0" w:line="240" w:lineRule="auto"/>
+        <w:ind w:left="0" w:leftChars="0" w:right="0" w:rightChars="0" w:firstLine="0" w:firstLineChars="0"/>
+        <w:jc w:val="both"/>
+      </w:pPr>
+    </w:p>
+    <w:p>
+      <w:pPr>
+        <w:spacing w:before="0" w:beforeLines="0" w:after="0" w:afterLines="0" w:line="240" w:lineRule="auto"/>
+        <w:ind w:left="0" w:leftChars="0" w:right="0" w:rightChars="0" w:firstLine="0" w:firstLineChars="0"/>
+        <w:jc w:val="both"/>
+      </w:pPr>
+    </w:p>
+    <w:p>
+      <w:pPr>
+        <w:spacing w:before="0" w:beforeLines="0" w:after="0" w:afterLines="0" w:line="240" w:lineRule="auto"/>
+        <w:ind w:left="0" w:leftChars="0" w:right="0" w:rightChars="0" w:firstLine="0" w:firstLineChars="0"/>
+        <w:jc w:val="both"/>
+      </w:pPr>
+    </w:p>
+    <w:p>
+      <w:pPr>
+        <w:spacing w:before="0" w:beforeLines="0" w:after="0" w:afterLines="0" w:line="240" w:lineRule="auto"/>
+        <w:ind w:left="0" w:leftChars="0" w:right="0" w:rightChars="0" w:firstLine="0" w:firstLineChars="0"/>
+        <w:jc w:val="both"/>
+      </w:pPr>
+    </w:p>
+    <w:p>
+      <w:pPr>
+        <w:spacing w:before="0" w:beforeLines="0" w:after="0" w:afterLines="0" w:line="240" w:lineRule="auto"/>
+        <w:ind w:left="0" w:leftChars="0" w:right="0" w:rightChars="0" w:firstLine="0" w:firstLineChars="0"/>
+        <w:jc w:val="both"/>
+      </w:pPr>
+    </w:p>
+    <w:p>
+      <w:pPr>
+        <w:spacing w:before="0" w:beforeLines="0" w:after="0" w:afterLines="0" w:line="240" w:lineRule="auto"/>
+        <w:ind w:left="0" w:leftChars="0" w:right="0" w:rightChars="0" w:firstLine="0" w:firstLineChars="0"/>
+        <w:jc w:val="both"/>
+      </w:pPr>
+    </w:p>
+    <w:p>
+      <w:pPr>
+        <w:spacing w:before="0" w:beforeLines="0" w:after="0" w:afterLines="0" w:line="240" w:lineRule="auto"/>
+        <w:ind w:left="0" w:leftChars="0" w:right="0" w:rightChars="0" w:firstLine="0" w:firstLineChars="0"/>
+        <w:jc w:val="both"/>
+      </w:pPr>
+    </w:p>
+    <w:p>
+      <w:pPr>
+        <w:spacing w:before="0" w:beforeLines="0" w:after="0" w:afterLines="0" w:line="240" w:lineRule="auto"/>
+        <w:ind w:left="0" w:leftChars="0" w:right="0" w:rightChars="0" w:firstLine="0" w:firstLineChars="0"/>
+        <w:jc w:val="both"/>
+      </w:pPr>
+    </w:p>
+    <w:p>
+      <w:pPr>
+        <w:spacing w:before="0" w:beforeLines="0" w:after="0" w:afterLines="0" w:line="240" w:lineRule="auto"/>
+        <w:ind w:left="0" w:leftChars="0" w:right="0" w:rightChars="0" w:firstLine="0" w:firstLineChars="0"/>
+        <w:jc w:val="both"/>
+      </w:pPr>
+    </w:p>
+    <w:p>
+      <w:pPr>
+        <w:spacing w:before="0" w:beforeLines="0" w:after="0" w:afterLines="0" w:line="240" w:lineRule="auto"/>
+        <w:ind w:left="0" w:leftChars="0" w:right="0" w:rightChars="0" w:firstLine="0" w:firstLineChars="0"/>
+        <w:jc w:val="both"/>
+      </w:pPr>
+    </w:p>
+    <w:p>
+      <w:pPr>
+        <w:spacing w:before="0" w:beforeLines="0" w:after="0" w:afterLines="0" w:line="240" w:lineRule="auto"/>
+        <w:ind w:left="0" w:leftChars="0" w:right="0" w:rightChars="0" w:firstLine="0" w:firstLineChars="0"/>
+        <w:jc w:val="both"/>
+      </w:pPr>
+    </w:p>
+    <w:p>
+      <w:pPr>
+        <w:spacing w:before="0" w:beforeLines="0" w:after="0" w:afterLines="0" w:line="240" w:lineRule="auto"/>
+        <w:ind w:left="0" w:leftChars="0" w:right="0" w:rightChars="0" w:firstLine="0" w:firstLineChars="0"/>
+        <w:jc w:val="both"/>
+      </w:pPr>
+    </w:p>
+    <w:p>
+      <w:pPr>
+        <w:spacing w:before="0" w:beforeLines="0" w:after="0" w:afterLines="0" w:line="240" w:lineRule="auto"/>
+        <w:ind w:left="0" w:leftChars="0" w:right="0" w:rightChars="0" w:firstLine="0" w:firstLineChars="0"/>
+        <w:jc w:val="both"/>
+      </w:pPr>
+    </w:p>
+    <w:p>
+      <w:pPr>
+        <w:spacing w:before="0" w:beforeLines="0" w:after="0" w:afterLines="0" w:line="240" w:lineRule="auto"/>
+        <w:ind w:left="0" w:leftChars="0" w:right="0" w:rightChars="0" w:firstLine="0" w:firstLineChars="0"/>
+        <w:jc w:val="both"/>
+      </w:pPr>
+    </w:p>
+    <w:p>
+      <w:pPr>
+        <w:spacing w:before="0" w:beforeLines="0" w:after="0" w:afterLines="0" w:line="240" w:lineRule="auto"/>
+        <w:ind w:left="0" w:leftChars="0" w:right="0" w:rightChars="0" w:firstLine="0" w:firstLineChars="0"/>
+        <w:jc w:val="both"/>
+      </w:pPr>
+    </w:p>
+    <w:p>
+      <w:pPr>
+        <w:spacing w:before="0" w:beforeLines="0" w:after="0" w:afterLines="0" w:line="240" w:lineRule="auto"/>
+        <w:ind w:left="0" w:leftChars="0" w:right="0" w:rightChars="0" w:firstLine="0" w:firstLineChars="0"/>
+        <w:jc w:val="both"/>
+      </w:pPr>
+    </w:p>
+    <w:p>
+      <w:pPr>
+        <w:spacing w:before="0" w:beforeLines="0" w:after="0" w:afterLines="0" w:line="240" w:lineRule="auto"/>
+        <w:ind w:left="0" w:leftChars="0" w:right="0" w:rightChars="0" w:firstLine="0" w:firstLineChars="0"/>
+        <w:jc w:val="both"/>
+      </w:pPr>
+    </w:p>
+    <w:p>
+      <w:pPr>
+        <w:spacing w:before="0" w:beforeLines="0" w:after="0" w:afterLines="0" w:line="240" w:lineRule="auto"/>
+        <w:ind w:left="0" w:leftChars="0" w:right="0" w:rightChars="0" w:firstLine="0" w:firstLineChars="0"/>
+        <w:jc w:val="both"/>
+      </w:pPr>
+    </w:p>
+    <w:p>
+      <w:pPr>
+        <w:spacing w:before="0" w:beforeLines="0" w:after="0" w:afterLines="0" w:line="240" w:lineRule="auto"/>
+        <w:ind w:left="0" w:leftChars="0" w:right="0" w:rightChars="0" w:firstLine="0" w:firstLineChars="0"/>
+        <w:jc w:val="both"/>
+      </w:pPr>
+    </w:p>
+    <w:p>
+      <w:pPr>
+        <w:spacing w:before="0" w:beforeLines="0" w:after="0" w:afterLines="0" w:line="240" w:lineRule="auto"/>
+        <w:ind w:left="0" w:leftChars="0" w:right="0" w:rightChars="0" w:firstLine="0" w:firstLineChars="0"/>
+        <w:jc w:val="both"/>
+      </w:pPr>
+    </w:p>
+    <w:p>
+      <w:pPr>
+        <w:spacing w:before="0" w:beforeLines="0" w:after="0" w:afterLines="0" w:line="240" w:lineRule="auto"/>
+        <w:ind w:left="0" w:leftChars="0" w:right="0" w:rightChars="0" w:firstLine="0" w:firstLineChars="0"/>
+        <w:jc w:val="both"/>
+      </w:pPr>
+    </w:p>
+    <w:p>
+      <w:pPr>
+        <w:spacing w:before="0" w:beforeLines="0" w:after="0" w:afterLines="0" w:line="240" w:lineRule="auto"/>
+        <w:ind w:left="0" w:leftChars="0" w:right="0" w:rightChars="0" w:firstLine="0" w:firstLineChars="0"/>
+        <w:jc w:val="both"/>
+      </w:pPr>
+    </w:p>
+    <w:p>
+      <w:pPr>
+        <w:spacing w:before="0" w:beforeLines="0" w:after="0" w:afterLines="0" w:line="240" w:lineRule="auto"/>
+        <w:ind w:left="0" w:leftChars="0" w:right="0" w:rightChars="0" w:firstLine="0" w:firstLineChars="0"/>
+        <w:jc w:val="both"/>
+      </w:pPr>
+    </w:p>
+    <w:p>
+      <w:pPr>
+        <w:spacing w:before="0" w:beforeLines="0" w:after="0" w:afterLines="0" w:line="240" w:lineRule="auto"/>
+        <w:ind w:left="0" w:leftChars="0" w:right="0" w:rightChars="0" w:firstLine="0" w:firstLineChars="0"/>
+        <w:jc w:val="both"/>
+      </w:pPr>
+    </w:p>
+    <w:p>
+      <w:pPr>
+        <w:spacing w:before="0" w:beforeLines="0" w:after="0" w:afterLines="0" w:line="240" w:lineRule="auto"/>
+        <w:ind w:left="0" w:leftChars="0" w:right="0" w:rightChars="0" w:firstLine="0" w:firstLineChars="0"/>
+        <w:jc w:val="both"/>
+      </w:pPr>
+    </w:p>
+    <w:p>
+      <w:pPr>
+        <w:spacing w:before="0" w:beforeLines="0" w:after="0" w:afterLines="0" w:line="240" w:lineRule="auto"/>
+        <w:ind w:left="0" w:leftChars="0" w:right="0" w:rightChars="0" w:firstLine="0" w:firstLineChars="0"/>
+        <w:jc w:val="both"/>
+      </w:pPr>
+    </w:p>
+    <w:p>
+      <w:pPr>
+        <w:spacing w:before="0" w:beforeLines="0" w:after="0" w:afterLines="0" w:line="240" w:lineRule="auto"/>
+        <w:ind w:left="0" w:leftChars="0" w:right="0" w:rightChars="0" w:firstLine="0" w:firstLineChars="0"/>
+        <w:jc w:val="both"/>
+      </w:pPr>
+    </w:p>
+    <w:p>
+      <w:pPr>
         <w:pStyle w:val="2"/>
         <w:bidi w:val="0"/>
         <w:rPr>
@@ -2570,324 +3543,84 @@
     </w:p>
     <w:p>
       <w:pPr>
-        <w:numPr>
-          <w:ilvl w:val="0"/>
-          <w:numId w:val="1"/>
-        </w:numPr>
-        <w:spacing w:before="100" w:beforeAutospacing="1" w:after="100" w:afterAutospacing="1"/>
-        <w:rPr>
-          <w:rFonts w:ascii="Times New Roman" w:hAnsi="Times New Roman" w:eastAsia="Times New Roman" w:cs="Times New Roman"/>
-          <w:lang w:val="en-US"/>
-        </w:rPr>
-      </w:pPr>
-      <w:r>
-        <w:rPr>
-          <w:rFonts w:ascii="Times New Roman" w:hAnsi="Times New Roman" w:eastAsia="Times New Roman" w:cs="Times New Roman"/>
-          <w:lang w:val="en-US"/>
-        </w:rPr>
-        <w:t>T. H. Cormen, C. E. Leiserson, R. L. Rivest, and C. Stein, Introduction to Algorithms, 3rd ed. MIT Press, 2009.</w:t>
-      </w:r>
-    </w:p>
-    <w:p>
-      <w:pPr>
-        <w:numPr>
-          <w:ilvl w:val="0"/>
-          <w:numId w:val="1"/>
-        </w:numPr>
-        <w:spacing w:before="100" w:beforeAutospacing="1" w:after="100" w:afterAutospacing="1"/>
-        <w:rPr>
-          <w:rFonts w:ascii="Times New Roman" w:hAnsi="Times New Roman" w:eastAsia="Times New Roman" w:cs="Times New Roman"/>
-          <w:lang w:val="en-US"/>
-        </w:rPr>
-      </w:pPr>
-      <w:r>
-        <w:rPr>
-          <w:rFonts w:ascii="Times New Roman" w:hAnsi="Times New Roman" w:eastAsia="Times New Roman" w:cs="Times New Roman"/>
-          <w:lang w:val="en-US"/>
-        </w:rPr>
-        <w:t>A. Drozdek, Data Structures and Algorithms in C++, 4th ed. Cengage Learning, 2012.</w:t>
-      </w:r>
-    </w:p>
-    <w:p>
-      <w:pPr>
-        <w:numPr>
-          <w:ilvl w:val="0"/>
-          <w:numId w:val="1"/>
-        </w:numPr>
-        <w:spacing w:before="100" w:beforeAutospacing="1" w:after="100" w:afterAutospacing="1"/>
-        <w:rPr>
-          <w:rFonts w:ascii="Times New Roman" w:hAnsi="Times New Roman" w:eastAsia="Times New Roman" w:cs="Times New Roman"/>
-          <w:lang w:val="en-US"/>
-        </w:rPr>
-      </w:pPr>
-      <w:r>
-        <w:rPr>
-          <w:rFonts w:ascii="Times New Roman" w:hAnsi="Times New Roman" w:eastAsia="Times New Roman" w:cs="Times New Roman"/>
-          <w:lang w:val="en-US"/>
-        </w:rPr>
-        <w:t>B. Stroustrup, The C++ Programming Language, 4th ed. Addison-Wesley, 2013.</w:t>
-      </w:r>
-    </w:p>
-    <w:p>
-      <w:pPr>
-        <w:numPr>
-          <w:ilvl w:val="0"/>
-          <w:numId w:val="1"/>
-        </w:numPr>
-        <w:spacing w:before="100" w:beforeAutospacing="1" w:after="100" w:afterAutospacing="1"/>
-        <w:ind w:left="0" w:leftChars="0" w:firstLine="0" w:firstLineChars="0"/>
-        <w:rPr>
-          <w:rFonts w:ascii="Times New Roman" w:hAnsi="Times New Roman" w:eastAsia="Times New Roman" w:cs="Times New Roman"/>
-          <w:lang w:val="en-US"/>
-        </w:rPr>
-      </w:pPr>
-      <w:r>
-        <w:rPr>
-          <w:rFonts w:ascii="Times New Roman" w:hAnsi="Times New Roman" w:eastAsia="Times New Roman" w:cs="Times New Roman"/>
-          <w:lang w:val="en-US"/>
-        </w:rPr>
-        <w:t xml:space="preserve">GeeksforGeeks, "Binary Search Tree Data Structure." [Online]. Available: </w:t>
-      </w:r>
-      <w:r>
-        <w:rPr>
-          <w:rFonts w:ascii="Times New Roman" w:hAnsi="Times New Roman" w:eastAsia="Times New Roman" w:cs="Times New Roman"/>
-          <w:color w:val="0000FF"/>
-          <w:lang w:val="en-US"/>
-        </w:rPr>
+        <w:bidi w:val="0"/>
+      </w:pPr>
+      <w:r>
+        <w:t>[1] A. Silberschatz, P. B. Galvin, and G. Gagne, Operating System Concepts, 10th ed. Wiley, 2018.</w:t>
+      </w:r>
+    </w:p>
+    <w:p>
+      <w:pPr>
+        <w:bidi w:val="0"/>
+      </w:pPr>
+      <w:r>
+        <w:t>[2] A. S. Tanenbaum and H. Bos, Modern Operating Systems, 4th ed. Pearson, 2014.</w:t>
+      </w:r>
+    </w:p>
+    <w:p>
+      <w:pPr>
+        <w:bidi w:val="0"/>
+      </w:pPr>
+      <w:r>
+        <w:t>[3] W. Stallings, Operating Systems: Internals and Design Principles, 9th ed. Pearson, 2017.</w:t>
+      </w:r>
+    </w:p>
+    <w:p>
+      <w:pPr>
+        <w:bidi w:val="0"/>
+      </w:pPr>
+      <w:r>
+        <w:t xml:space="preserve">[4] GeeksforGeeks, "Page Replacement Algorithms in Operating Systems." [Online]. Available: </w:t>
+      </w:r>
+      <w:r>
         <w:fldChar w:fldCharType="begin"/>
       </w:r>
       <w:r>
-        <w:rPr>
-          <w:rFonts w:ascii="Times New Roman" w:hAnsi="Times New Roman" w:eastAsia="Times New Roman" w:cs="Times New Roman"/>
-          <w:color w:val="0000FF"/>
-          <w:lang w:val="en-US"/>
-        </w:rPr>
-        <w:instrText xml:space="preserve"> HYPERLINK "https://www.geeksforgeeks.org/binary-search-tree-data-structure/" \t "_blank" </w:instrText>
-      </w:r>
-      <w:r>
-        <w:rPr>
-          <w:rFonts w:ascii="Times New Roman" w:hAnsi="Times New Roman" w:eastAsia="Times New Roman" w:cs="Times New Roman"/>
-          <w:color w:val="0000FF"/>
-          <w:lang w:val="en-US"/>
-        </w:rPr>
+        <w:instrText xml:space="preserve"> HYPERLINK "https://www.geeksforgeeks.org/page-replacement-algorithms-in-operating-systems/" \t "_blank" </w:instrText>
+      </w:r>
+      <w:r>
         <w:fldChar w:fldCharType="separate"/>
       </w:r>
       <w:r>
         <w:rPr>
-          <w:rFonts w:ascii="Times New Roman" w:hAnsi="Times New Roman" w:eastAsia="Times New Roman" w:cs="Times New Roman"/>
-          <w:color w:val="0000FF"/>
-          <w:lang w:val="en-US"/>
-        </w:rPr>
-        <w:t>https://www.geeksforgeeks.org/binary-search-tree-data-structure/</w:t>
-      </w:r>
-      <w:r>
-        <w:rPr>
-          <w:rFonts w:ascii="Times New Roman" w:hAnsi="Times New Roman" w:eastAsia="Times New Roman" w:cs="Times New Roman"/>
-          <w:color w:val="0000FF"/>
-          <w:lang w:val="en-US"/>
-        </w:rPr>
+          <w:rStyle w:val="17"/>
+        </w:rPr>
+        <w:t>https://www.geeksforgeeks.org/page-replacement-algorithms-in-operating-systems/</w:t>
+      </w:r>
+      <w:r>
         <w:fldChar w:fldCharType="end"/>
       </w:r>
       <w:r>
-        <w:rPr>
-          <w:rFonts w:ascii="Times New Roman" w:hAnsi="Times New Roman" w:eastAsia="Times New Roman" w:cs="Times New Roman"/>
-          <w:lang w:val="en-US"/>
-        </w:rPr>
-        <w:t>. Accessed: Feb. 07, 2026.</w:t>
-      </w:r>
-    </w:p>
-    <w:p>
-      <w:pPr>
-        <w:numPr>
-          <w:ilvl w:val="0"/>
-          <w:numId w:val="0"/>
-        </w:numPr>
-        <w:spacing w:before="100" w:beforeAutospacing="1" w:after="100" w:afterAutospacing="1"/>
-        <w:ind w:leftChars="0"/>
-        <w:rPr>
-          <w:rFonts w:ascii="Times New Roman" w:hAnsi="Times New Roman" w:eastAsia="Times New Roman" w:cs="Times New Roman"/>
-          <w:lang w:val="en-US"/>
-        </w:rPr>
-      </w:pPr>
-      <w:r>
-        <w:rPr>
-          <w:rFonts w:ascii="Times New Roman" w:hAnsi="Times New Roman" w:eastAsia="Times New Roman" w:cs="Times New Roman"/>
-          <w:lang w:val="en-US"/>
-        </w:rPr>
-        <w:t xml:space="preserve">[5] Programiz, "Doubly Linked List Implementation." [Online]. Available: </w:t>
-      </w:r>
-      <w:r>
-        <w:rPr>
-          <w:rFonts w:ascii="Times New Roman" w:hAnsi="Times New Roman" w:eastAsia="Times New Roman" w:cs="Times New Roman"/>
-          <w:color w:val="0000FF"/>
-          <w:lang w:val="en-US"/>
-        </w:rPr>
+        <w:t>. Accessed: Mar. 16, 2026.</w:t>
+      </w:r>
+    </w:p>
+    <w:p>
+      <w:pPr>
+        <w:bidi w:val="0"/>
+      </w:pPr>
+      <w:r>
+        <w:t xml:space="preserve">[5] Python Software Foundation, "tkinter — Python interface to Tcl/Tk." [Online]. Available: </w:t>
+      </w:r>
+      <w:r>
         <w:fldChar w:fldCharType="begin"/>
       </w:r>
       <w:r>
-        <w:rPr>
-          <w:rFonts w:ascii="Times New Roman" w:hAnsi="Times New Roman" w:eastAsia="Times New Roman" w:cs="Times New Roman"/>
-          <w:color w:val="0000FF"/>
-          <w:lang w:val="en-US"/>
-        </w:rPr>
-        <w:instrText xml:space="preserve"> HYPERLINK "https://www.programiz.com/dsa/doubly-linked-list" \t "_blank" </w:instrText>
-      </w:r>
-      <w:r>
-        <w:rPr>
-          <w:rFonts w:ascii="Times New Roman" w:hAnsi="Times New Roman" w:eastAsia="Times New Roman" w:cs="Times New Roman"/>
-          <w:color w:val="0000FF"/>
-          <w:lang w:val="en-US"/>
-        </w:rPr>
+        <w:instrText xml:space="preserve"> HYPERLINK "https://docs.python.org/3/library/tkinter.html" \t "_blank" </w:instrText>
+      </w:r>
+      <w:r>
         <w:fldChar w:fldCharType="separate"/>
       </w:r>
       <w:r>
         <w:rPr>
-          <w:rFonts w:ascii="Times New Roman" w:hAnsi="Times New Roman" w:eastAsia="Times New Roman" w:cs="Times New Roman"/>
-          <w:color w:val="0000FF"/>
-          <w:lang w:val="en-US"/>
-        </w:rPr>
-        <w:t>https://www.programiz.com/dsa/doubly-linked-list</w:t>
-      </w:r>
-      <w:r>
-        <w:rPr>
-          <w:rFonts w:ascii="Times New Roman" w:hAnsi="Times New Roman" w:eastAsia="Times New Roman" w:cs="Times New Roman"/>
-          <w:color w:val="0000FF"/>
-          <w:lang w:val="en-US"/>
-        </w:rPr>
+          <w:rStyle w:val="17"/>
+        </w:rPr>
+        <w:t>https://docs.python.org/3/library/tkinter.html</w:t>
+      </w:r>
+      <w:r>
         <w:fldChar w:fldCharType="end"/>
       </w:r>
       <w:r>
-        <w:rPr>
-          <w:rFonts w:ascii="Times New Roman" w:hAnsi="Times New Roman" w:eastAsia="Times New Roman" w:cs="Times New Roman"/>
-          <w:lang w:val="en-US"/>
-        </w:rPr>
-        <w:t>. Accessed: Feb. 07, 2026.</w:t>
-      </w:r>
-    </w:p>
-    <w:p>
-      <w:pPr>
-        <w:spacing w:before="100" w:beforeAutospacing="1" w:after="100" w:afterAutospacing="1"/>
-        <w:rPr>
-          <w:rFonts w:ascii="Times New Roman" w:hAnsi="Times New Roman" w:eastAsia="Times New Roman" w:cs="Times New Roman"/>
-          <w:lang w:val="en-US"/>
-        </w:rPr>
-      </w:pPr>
-      <w:r>
-        <w:rPr>
-          <w:rFonts w:ascii="Times New Roman" w:hAnsi="Times New Roman" w:eastAsia="Times New Roman" w:cs="Times New Roman"/>
-          <w:lang w:val="en-US"/>
-        </w:rPr>
-        <w:t xml:space="preserve">[6] Microsoft, "Console Reference - Windows Console API." [Online]. Available: </w:t>
-      </w:r>
-      <w:r>
-        <w:rPr>
-          <w:rFonts w:ascii="Times New Roman" w:hAnsi="Times New Roman" w:eastAsia="Times New Roman" w:cs="Times New Roman"/>
-          <w:color w:val="0000FF"/>
-          <w:lang w:val="en-US"/>
-        </w:rPr>
-        <w:fldChar w:fldCharType="begin"/>
-      </w:r>
-      <w:r>
-        <w:rPr>
-          <w:rFonts w:ascii="Times New Roman" w:hAnsi="Times New Roman" w:eastAsia="Times New Roman" w:cs="Times New Roman"/>
-          <w:color w:val="0000FF"/>
-          <w:lang w:val="en-US"/>
-        </w:rPr>
-        <w:instrText xml:space="preserve"> HYPERLINK "https://learn.microsoft.com/en-us/windows/console/console-reference" \t "_blank" </w:instrText>
-      </w:r>
-      <w:r>
-        <w:rPr>
-          <w:rFonts w:ascii="Times New Roman" w:hAnsi="Times New Roman" w:eastAsia="Times New Roman" w:cs="Times New Roman"/>
-          <w:color w:val="0000FF"/>
-          <w:lang w:val="en-US"/>
-        </w:rPr>
-        <w:fldChar w:fldCharType="separate"/>
-      </w:r>
-      <w:r>
-        <w:rPr>
-          <w:rFonts w:ascii="Times New Roman" w:hAnsi="Times New Roman" w:eastAsia="Times New Roman" w:cs="Times New Roman"/>
-          <w:color w:val="0000FF"/>
-          <w:lang w:val="en-US"/>
-        </w:rPr>
-        <w:t>https://learn.microsoft.com/en-us/windows/console/console-reference</w:t>
-      </w:r>
-      <w:r>
-        <w:rPr>
-          <w:rFonts w:ascii="Times New Roman" w:hAnsi="Times New Roman" w:eastAsia="Times New Roman" w:cs="Times New Roman"/>
-          <w:color w:val="0000FF"/>
-          <w:lang w:val="en-US"/>
-        </w:rPr>
-        <w:fldChar w:fldCharType="end"/>
-      </w:r>
-      <w:r>
-        <w:rPr>
-          <w:rFonts w:ascii="Times New Roman" w:hAnsi="Times New Roman" w:eastAsia="Times New Roman" w:cs="Times New Roman"/>
-          <w:lang w:val="en-US"/>
-        </w:rPr>
-        <w:t>. Accessed: Feb. 07, 2026.</w:t>
-      </w:r>
-    </w:p>
-    <w:p>
-      <w:pPr>
-        <w:spacing w:before="100" w:beforeAutospacing="1" w:after="100" w:afterAutospacing="1"/>
-        <w:rPr>
-          <w:rFonts w:ascii="Times New Roman" w:hAnsi="Times New Roman" w:eastAsia="Times New Roman" w:cs="Times New Roman"/>
-          <w:lang w:val="en-US"/>
-        </w:rPr>
-      </w:pPr>
-      <w:r>
-        <w:rPr>
-          <w:rFonts w:ascii="Times New Roman" w:hAnsi="Times New Roman" w:eastAsia="Times New Roman" w:cs="Times New Roman"/>
-          <w:lang w:val="en-US"/>
-        </w:rPr>
-        <w:t xml:space="preserve">[7] cplusplus.com, "Input/Output with files in C++." [Online]. Available: </w:t>
-      </w:r>
-      <w:r>
-        <w:rPr>
-          <w:rFonts w:ascii="Times New Roman" w:hAnsi="Times New Roman" w:eastAsia="Times New Roman" w:cs="Times New Roman"/>
-          <w:color w:val="0000FF"/>
-          <w:lang w:val="en-US"/>
-        </w:rPr>
-        <w:fldChar w:fldCharType="begin"/>
-      </w:r>
-      <w:r>
-        <w:rPr>
-          <w:rFonts w:ascii="Times New Roman" w:hAnsi="Times New Roman" w:eastAsia="Times New Roman" w:cs="Times New Roman"/>
-          <w:color w:val="0000FF"/>
-          <w:lang w:val="en-US"/>
-        </w:rPr>
-        <w:instrText xml:space="preserve"> HYPERLINK "https://cplusplus.com/doc/tutorial/files/" \t "_blank" </w:instrText>
-      </w:r>
-      <w:r>
-        <w:rPr>
-          <w:rFonts w:ascii="Times New Roman" w:hAnsi="Times New Roman" w:eastAsia="Times New Roman" w:cs="Times New Roman"/>
-          <w:color w:val="0000FF"/>
-          <w:lang w:val="en-US"/>
-        </w:rPr>
-        <w:fldChar w:fldCharType="separate"/>
-      </w:r>
-      <w:r>
-        <w:rPr>
-          <w:rFonts w:ascii="Times New Roman" w:hAnsi="Times New Roman" w:eastAsia="Times New Roman" w:cs="Times New Roman"/>
-          <w:color w:val="0000FF"/>
-          <w:lang w:val="en-US"/>
-        </w:rPr>
-        <w:t>https://cplusplus.com/doc/tutorial/files/</w:t>
-      </w:r>
-      <w:r>
-        <w:rPr>
-          <w:rFonts w:ascii="Times New Roman" w:hAnsi="Times New Roman" w:eastAsia="Times New Roman" w:cs="Times New Roman"/>
-          <w:color w:val="0000FF"/>
-          <w:lang w:val="en-US"/>
-        </w:rPr>
-        <w:fldChar w:fldCharType="end"/>
-      </w:r>
-      <w:r>
-        <w:rPr>
-          <w:rFonts w:ascii="Times New Roman" w:hAnsi="Times New Roman" w:eastAsia="Times New Roman" w:cs="Times New Roman"/>
-          <w:lang w:val="en-US"/>
-        </w:rPr>
-        <w:t>. Accessed: Feb. 07, 2026.</w:t>
+        <w:t>. Accessed: Mar. 16, 2026.</w:t>
       </w:r>
     </w:p>
     <w:p>
@@ -3494,26 +4227,6 @@
     </w:pPr>
   </w:p>
 </w:hdr>
-</file>
-
-<file path=word/numbering.xml><?xml version="1.0" encoding="utf-8"?>
-<w:numbering xmlns:wpc="http://schemas.microsoft.com/office/word/2010/wordprocessingCanvas" xmlns:mc="http://schemas.openxmlformats.org/markup-compatibility/2006" xmlns:o="urn:schemas-microsoft-com:office:office" xmlns:r="http://schemas.openxmlformats.org/officeDocument/2006/relationships" xmlns:m="http://schemas.openxmlformats.org/officeDocument/2006/math" xmlns:v="urn:schemas-microsoft-com:vml" xmlns:wp14="http://schemas.microsoft.com/office/word/2010/wordprocessingDrawing" xmlns:wp="http://schemas.openxmlformats.org/drawingml/2006/wordprocessingDrawing" xmlns:w10="urn:schemas-microsoft-com:office:word" xmlns:w="http://schemas.openxmlformats.org/wordprocessingml/2006/main" xmlns:w14="http://schemas.microsoft.com/office/word/2010/wordml" xmlns:wpg="http://schemas.microsoft.com/office/word/2010/wordprocessingGroup" xmlns:wpi="http://schemas.microsoft.com/office/word/2010/wordprocessingInk" xmlns:wne="http://schemas.microsoft.com/office/word/2006/wordml" xmlns:wps="http://schemas.microsoft.com/office/word/2010/wordprocessingShape" xmlns:wpsCustomData="http://www.wps.cn/officeDocument/2013/wpsCustomData" mc:Ignorable="w14 wp14">
-  <w:abstractNum w:abstractNumId="0">
-    <w:nsid w:val="4A2F4624"/>
-    <w:multiLevelType w:val="singleLevel"/>
-    <w:tmpl w:val="4A2F4624"/>
-    <w:lvl w:ilvl="0" w:tentative="0">
-      <w:start w:val="1"/>
-      <w:numFmt w:val="decimal"/>
-      <w:suff w:val="space"/>
-      <w:lvlText w:val="[%1]"/>
-      <w:lvlJc w:val="left"/>
-    </w:lvl>
-  </w:abstractNum>
-  <w:num w:numId="1">
-    <w:abstractNumId w:val="0"/>
-  </w:num>
-</w:numbering>
 </file>
 
 <file path=word/styles.xml><?xml version="1.0" encoding="utf-8"?>

</xml_diff>

<commit_message>
Đổi link video và sửa lỗi pp
</commit_message>
<xml_diff>
--- a/DOCX/BAO_CAO_GROUP10.docx
+++ b/DOCX/BAO_CAO_GROUP10.docx
@@ -4807,7 +4807,7 @@
         <w:rPr>
           <w:rFonts w:hint="default"/>
         </w:rPr>
-        <w:instrText xml:space="preserve"> HYPERLINK "https://drive.google.com/file/d/1dTVpf88p2xU9rL-oT1QviHGybhmhU2wR/view?usp=drivesdk" </w:instrText>
+        <w:instrText xml:space="preserve"> HYPERLINK "https://drive.google.com/file/d/1HjeQ9nNARoMyZNcRa19Y6-MIucmqzFqy/view?usp=drivesdk" </w:instrText>
       </w:r>
       <w:r>
         <w:rPr>
@@ -4820,7 +4820,7 @@
           <w:rStyle w:val="17"/>
           <w:rFonts w:hint="default"/>
         </w:rPr>
-        <w:t>https://drive.google.com/file/d/1dTVpf88p2xU9rL-oT1QviHGybhmhU2wR/view?usp=drivesdk</w:t>
+        <w:t>https://drive.google.com/file/d/1HjeQ9nNARoMyZNcRa19Y6-MIucmqzFqy/view?usp=drivesdk</w:t>
       </w:r>
       <w:r>
         <w:rPr>
@@ -4828,6 +4828,15 @@
         </w:rPr>
         <w:fldChar w:fldCharType="end"/>
       </w:r>
+      <w:r>
+        <w:rPr>
+          <w:rFonts w:hint="default"/>
+          <w:lang w:val="vi-VN"/>
+        </w:rPr>
+        <w:t xml:space="preserve"> </w:t>
+      </w:r>
+      <w:bookmarkStart w:id="25" w:name="_GoBack"/>
+      <w:bookmarkEnd w:id="25"/>
       <w:r>
         <w:rPr>
           <w:rFonts w:hint="default"/>
@@ -5096,8 +5105,6 @@
       <w:pPr>
         <w:bidi w:val="0"/>
       </w:pPr>
-      <w:bookmarkStart w:id="25" w:name="_GoBack"/>
-      <w:bookmarkEnd w:id="25"/>
       <w:bookmarkStart w:id="5" w:name="_Toc219926507"/>
       <w:bookmarkStart w:id="6" w:name="_Toc12896"/>
       <w:bookmarkStart w:id="7" w:name="_Toc27170"/>

</xml_diff>